<commit_message>
feat: add marketing site, self-serve signup, billing, and app fixes
</commit_message>
<xml_diff>
--- a/docs/Distrik-Platform-Flow.docx
+++ b/docs/Distrik-Platform-Flow.docx
@@ -111,7 +111,7 @@
     <w:sdt>
       <w:sdtPr>
         <w:alias w:val="Contents"/>
-        <w:id w:val="2116932532"/>
+        <w:id w:val="-292908451"/>
       </w:sdtPr>
       <w:sdtEndPr/>
       <w:sdtContent>
@@ -134,7 +134,7 @@
           <w:r>
             <w:fldChar w:fldCharType="separate"/>
           </w:r>
-          <w:hyperlink w:anchor="_Toc243331410" w:history="1">
+          <w:hyperlink w:anchor="_Toc243418975" w:history="1">
             <w:r>
               <w:rPr>
                 <w:rStyle w:val="Hyperlink"/>
@@ -158,7 +158,7 @@
               <w:rPr>
                 <w:noProof/>
               </w:rPr>
-              <w:instrText xml:space="preserve"> PAGEREF _Toc243331410 \h </w:instrText>
+              <w:instrText xml:space="preserve"> PAGEREF _Toc243418975 \h </w:instrText>
             </w:r>
             <w:r>
               <w:rPr>
@@ -195,7 +195,7 @@
               <w:noProof/>
             </w:rPr>
           </w:pPr>
-          <w:hyperlink w:anchor="_Toc243331411" w:history="1">
+          <w:hyperlink w:anchor="_Toc243418976" w:history="1">
             <w:r>
               <w:rPr>
                 <w:rStyle w:val="Hyperlink"/>
@@ -219,7 +219,7 @@
               <w:rPr>
                 <w:noProof/>
               </w:rPr>
-              <w:instrText xml:space="preserve"> PAGEREF _Toc243331411 \h </w:instrText>
+              <w:instrText xml:space="preserve"> PAGEREF _Toc243418976 \h </w:instrText>
             </w:r>
             <w:r>
               <w:rPr>
@@ -256,7 +256,7 @@
               <w:noProof/>
             </w:rPr>
           </w:pPr>
-          <w:hyperlink w:anchor="_Toc243331412" w:history="1">
+          <w:hyperlink w:anchor="_Toc243418977" w:history="1">
             <w:r>
               <w:rPr>
                 <w:rStyle w:val="Hyperlink"/>
@@ -280,7 +280,7 @@
               <w:rPr>
                 <w:noProof/>
               </w:rPr>
-              <w:instrText xml:space="preserve"> PAGEREF _Toc243331412 \h </w:instrText>
+              <w:instrText xml:space="preserve"> PAGEREF _Toc243418977 \h </w:instrText>
             </w:r>
             <w:r>
               <w:rPr>
@@ -317,7 +317,7 @@
               <w:noProof/>
             </w:rPr>
           </w:pPr>
-          <w:hyperlink w:anchor="_Toc243331413" w:history="1">
+          <w:hyperlink w:anchor="_Toc243418978" w:history="1">
             <w:r>
               <w:rPr>
                 <w:rStyle w:val="Hyperlink"/>
@@ -341,7 +341,7 @@
               <w:rPr>
                 <w:noProof/>
               </w:rPr>
-              <w:instrText xml:space="preserve"> PAGEREF _Toc243331413 \h </w:instrText>
+              <w:instrText xml:space="preserve"> PAGEREF _Toc243418978 \h </w:instrText>
             </w:r>
             <w:r>
               <w:rPr>
@@ -378,7 +378,7 @@
               <w:noProof/>
             </w:rPr>
           </w:pPr>
-          <w:hyperlink w:anchor="_Toc243331414" w:history="1">
+          <w:hyperlink w:anchor="_Toc243418979" w:history="1">
             <w:r>
               <w:rPr>
                 <w:rStyle w:val="Hyperlink"/>
@@ -402,7 +402,7 @@
               <w:rPr>
                 <w:noProof/>
               </w:rPr>
-              <w:instrText xml:space="preserve"> PAGEREF _Toc243331414 \h </w:instrText>
+              <w:instrText xml:space="preserve"> PAGEREF _Toc243418979 \h </w:instrText>
             </w:r>
             <w:r>
               <w:rPr>
@@ -439,7 +439,7 @@
               <w:noProof/>
             </w:rPr>
           </w:pPr>
-          <w:hyperlink w:anchor="_Toc243331415" w:history="1">
+          <w:hyperlink w:anchor="_Toc243418980" w:history="1">
             <w:r>
               <w:rPr>
                 <w:rStyle w:val="Hyperlink"/>
@@ -463,7 +463,7 @@
               <w:rPr>
                 <w:noProof/>
               </w:rPr>
-              <w:instrText xml:space="preserve"> PAGEREF _Toc243331415 \h </w:instrText>
+              <w:instrText xml:space="preserve"> PAGEREF _Toc243418980 \h </w:instrText>
             </w:r>
             <w:r>
               <w:rPr>
@@ -500,7 +500,7 @@
               <w:noProof/>
             </w:rPr>
           </w:pPr>
-          <w:hyperlink w:anchor="_Toc243331416" w:history="1">
+          <w:hyperlink w:anchor="_Toc243418981" w:history="1">
             <w:r>
               <w:rPr>
                 <w:rStyle w:val="Hyperlink"/>
@@ -524,7 +524,7 @@
               <w:rPr>
                 <w:noProof/>
               </w:rPr>
-              <w:instrText xml:space="preserve"> PAGEREF _Toc243331416 \h </w:instrText>
+              <w:instrText xml:space="preserve"> PAGEREF _Toc243418981 \h </w:instrText>
             </w:r>
             <w:r>
               <w:rPr>
@@ -561,7 +561,7 @@
               <w:noProof/>
             </w:rPr>
           </w:pPr>
-          <w:hyperlink w:anchor="_Toc243331417" w:history="1">
+          <w:hyperlink w:anchor="_Toc243418982" w:history="1">
             <w:r>
               <w:rPr>
                 <w:rStyle w:val="Hyperlink"/>
@@ -585,7 +585,7 @@
               <w:rPr>
                 <w:noProof/>
               </w:rPr>
-              <w:instrText xml:space="preserve"> PAGEREF _Toc243331417 \h </w:instrText>
+              <w:instrText xml:space="preserve"> PAGEREF _Toc243418982 \h </w:instrText>
             </w:r>
             <w:r>
               <w:rPr>
@@ -622,7 +622,7 @@
               <w:noProof/>
             </w:rPr>
           </w:pPr>
-          <w:hyperlink w:anchor="_Toc243331418" w:history="1">
+          <w:hyperlink w:anchor="_Toc243418983" w:history="1">
             <w:r>
               <w:rPr>
                 <w:rStyle w:val="Hyperlink"/>
@@ -646,7 +646,7 @@
               <w:rPr>
                 <w:noProof/>
               </w:rPr>
-              <w:instrText xml:space="preserve"> PAGEREF _Toc243331418 \h </w:instrText>
+              <w:instrText xml:space="preserve"> PAGEREF _Toc243418983 \h </w:instrText>
             </w:r>
             <w:r>
               <w:rPr>
@@ -683,7 +683,7 @@
               <w:noProof/>
             </w:rPr>
           </w:pPr>
-          <w:hyperlink w:anchor="_Toc243331419" w:history="1">
+          <w:hyperlink w:anchor="_Toc243418984" w:history="1">
             <w:r>
               <w:rPr>
                 <w:rStyle w:val="Hyperlink"/>
@@ -707,7 +707,7 @@
               <w:rPr>
                 <w:noProof/>
               </w:rPr>
-              <w:instrText xml:space="preserve"> PAGEREF _Toc243331419 \h </w:instrText>
+              <w:instrText xml:space="preserve"> PAGEREF _Toc243418984 \h </w:instrText>
             </w:r>
             <w:r>
               <w:rPr>
@@ -744,7 +744,7 @@
               <w:noProof/>
             </w:rPr>
           </w:pPr>
-          <w:hyperlink w:anchor="_Toc243331420" w:history="1">
+          <w:hyperlink w:anchor="_Toc243418985" w:history="1">
             <w:r>
               <w:rPr>
                 <w:rStyle w:val="Hyperlink"/>
@@ -768,7 +768,7 @@
               <w:rPr>
                 <w:noProof/>
               </w:rPr>
-              <w:instrText xml:space="preserve"> PAGEREF _Toc243331420 \h </w:instrText>
+              <w:instrText xml:space="preserve"> PAGEREF _Toc243418985 \h </w:instrText>
             </w:r>
             <w:r>
               <w:rPr>
@@ -805,7 +805,7 @@
               <w:noProof/>
             </w:rPr>
           </w:pPr>
-          <w:hyperlink w:anchor="_Toc243331421" w:history="1">
+          <w:hyperlink w:anchor="_Toc243418986" w:history="1">
             <w:r>
               <w:rPr>
                 <w:rStyle w:val="Hyperlink"/>
@@ -829,7 +829,7 @@
               <w:rPr>
                 <w:noProof/>
               </w:rPr>
-              <w:instrText xml:space="preserve"> PAGEREF _Toc243331421 \h </w:instrText>
+              <w:instrText xml:space="preserve"> PAGEREF _Toc243418986 \h </w:instrText>
             </w:r>
             <w:r>
               <w:rPr>
@@ -866,7 +866,7 @@
               <w:noProof/>
             </w:rPr>
           </w:pPr>
-          <w:hyperlink w:anchor="_Toc243331422" w:history="1">
+          <w:hyperlink w:anchor="_Toc243418987" w:history="1">
             <w:r>
               <w:rPr>
                 <w:rStyle w:val="Hyperlink"/>
@@ -890,7 +890,7 @@
               <w:rPr>
                 <w:noProof/>
               </w:rPr>
-              <w:instrText xml:space="preserve"> PAGEREF _Toc243331422 \h </w:instrText>
+              <w:instrText xml:space="preserve"> PAGEREF _Toc243418987 \h </w:instrText>
             </w:r>
             <w:r>
               <w:rPr>
@@ -927,7 +927,7 @@
               <w:noProof/>
             </w:rPr>
           </w:pPr>
-          <w:hyperlink w:anchor="_Toc243331423" w:history="1">
+          <w:hyperlink w:anchor="_Toc243418988" w:history="1">
             <w:r>
               <w:rPr>
                 <w:rStyle w:val="Hyperlink"/>
@@ -951,7 +951,7 @@
               <w:rPr>
                 <w:noProof/>
               </w:rPr>
-              <w:instrText xml:space="preserve"> PAGEREF _Toc243331423 \h </w:instrText>
+              <w:instrText xml:space="preserve"> PAGEREF _Toc243418988 \h </w:instrText>
             </w:r>
             <w:r>
               <w:rPr>
@@ -988,7 +988,7 @@
               <w:noProof/>
             </w:rPr>
           </w:pPr>
-          <w:hyperlink w:anchor="_Toc243331424" w:history="1">
+          <w:hyperlink w:anchor="_Toc243418989" w:history="1">
             <w:r>
               <w:rPr>
                 <w:rStyle w:val="Hyperlink"/>
@@ -1012,7 +1012,7 @@
               <w:rPr>
                 <w:noProof/>
               </w:rPr>
-              <w:instrText xml:space="preserve"> PAGEREF _Toc243331424 \h </w:instrText>
+              <w:instrText xml:space="preserve"> PAGEREF _Toc243418989 \h </w:instrText>
             </w:r>
             <w:r>
               <w:rPr>
@@ -1049,7 +1049,7 @@
               <w:noProof/>
             </w:rPr>
           </w:pPr>
-          <w:hyperlink w:anchor="_Toc243331425" w:history="1">
+          <w:hyperlink w:anchor="_Toc243418990" w:history="1">
             <w:r>
               <w:rPr>
                 <w:rStyle w:val="Hyperlink"/>
@@ -1073,7 +1073,7 @@
               <w:rPr>
                 <w:noProof/>
               </w:rPr>
-              <w:instrText xml:space="preserve"> PAGEREF _Toc243331425 \h </w:instrText>
+              <w:instrText xml:space="preserve"> PAGEREF _Toc243418990 \h </w:instrText>
             </w:r>
             <w:r>
               <w:rPr>
@@ -1110,7 +1110,7 @@
               <w:noProof/>
             </w:rPr>
           </w:pPr>
-          <w:hyperlink w:anchor="_Toc243331426" w:history="1">
+          <w:hyperlink w:anchor="_Toc243418991" w:history="1">
             <w:r>
               <w:rPr>
                 <w:rStyle w:val="Hyperlink"/>
@@ -1134,7 +1134,7 @@
               <w:rPr>
                 <w:noProof/>
               </w:rPr>
-              <w:instrText xml:space="preserve"> PAGEREF _Toc243331426 \h </w:instrText>
+              <w:instrText xml:space="preserve"> PAGEREF _Toc243418991 \h </w:instrText>
             </w:r>
             <w:r>
               <w:rPr>
@@ -1171,7 +1171,7 @@
               <w:noProof/>
             </w:rPr>
           </w:pPr>
-          <w:hyperlink w:anchor="_Toc243331427" w:history="1">
+          <w:hyperlink w:anchor="_Toc243418992" w:history="1">
             <w:r>
               <w:rPr>
                 <w:rStyle w:val="Hyperlink"/>
@@ -1195,7 +1195,7 @@
               <w:rPr>
                 <w:noProof/>
               </w:rPr>
-              <w:instrText xml:space="preserve"> PAGEREF _Toc243331427 \h </w:instrText>
+              <w:instrText xml:space="preserve"> PAGEREF _Toc243418992 \h </w:instrText>
             </w:r>
             <w:r>
               <w:rPr>
@@ -1232,7 +1232,7 @@
               <w:noProof/>
             </w:rPr>
           </w:pPr>
-          <w:hyperlink w:anchor="_Toc243331428" w:history="1">
+          <w:hyperlink w:anchor="_Toc243418993" w:history="1">
             <w:r>
               <w:rPr>
                 <w:rStyle w:val="Hyperlink"/>
@@ -1256,7 +1256,7 @@
               <w:rPr>
                 <w:noProof/>
               </w:rPr>
-              <w:instrText xml:space="preserve"> PAGEREF _Toc243331428 \h </w:instrText>
+              <w:instrText xml:space="preserve"> PAGEREF _Toc243418993 \h </w:instrText>
             </w:r>
             <w:r>
               <w:rPr>
@@ -1293,7 +1293,7 @@
               <w:noProof/>
             </w:rPr>
           </w:pPr>
-          <w:hyperlink w:anchor="_Toc243331429" w:history="1">
+          <w:hyperlink w:anchor="_Toc243418994" w:history="1">
             <w:r>
               <w:rPr>
                 <w:rStyle w:val="Hyperlink"/>
@@ -1317,7 +1317,7 @@
               <w:rPr>
                 <w:noProof/>
               </w:rPr>
-              <w:instrText xml:space="preserve"> PAGEREF _Toc243331429 \h </w:instrText>
+              <w:instrText xml:space="preserve"> PAGEREF _Toc243418994 \h </w:instrText>
             </w:r>
             <w:r>
               <w:rPr>
@@ -1354,7 +1354,7 @@
               <w:noProof/>
             </w:rPr>
           </w:pPr>
-          <w:hyperlink w:anchor="_Toc243331430" w:history="1">
+          <w:hyperlink w:anchor="_Toc243418995" w:history="1">
             <w:r>
               <w:rPr>
                 <w:rStyle w:val="Hyperlink"/>
@@ -1378,7 +1378,7 @@
               <w:rPr>
                 <w:noProof/>
               </w:rPr>
-              <w:instrText xml:space="preserve"> PAGEREF _Toc243331430 \h </w:instrText>
+              <w:instrText xml:space="preserve"> PAGEREF _Toc243418995 \h </w:instrText>
             </w:r>
             <w:r>
               <w:rPr>
@@ -1415,7 +1415,7 @@
               <w:noProof/>
             </w:rPr>
           </w:pPr>
-          <w:hyperlink w:anchor="_Toc243331431" w:history="1">
+          <w:hyperlink w:anchor="_Toc243418996" w:history="1">
             <w:r>
               <w:rPr>
                 <w:rStyle w:val="Hyperlink"/>
@@ -1439,7 +1439,7 @@
               <w:rPr>
                 <w:noProof/>
               </w:rPr>
-              <w:instrText xml:space="preserve"> PAGEREF _Toc243331431 \h </w:instrText>
+              <w:instrText xml:space="preserve"> PAGEREF _Toc243418996 \h </w:instrText>
             </w:r>
             <w:r>
               <w:rPr>
@@ -1476,7 +1476,7 @@
               <w:noProof/>
             </w:rPr>
           </w:pPr>
-          <w:hyperlink w:anchor="_Toc243331432" w:history="1">
+          <w:hyperlink w:anchor="_Toc243418997" w:history="1">
             <w:r>
               <w:rPr>
                 <w:rStyle w:val="Hyperlink"/>
@@ -1500,7 +1500,7 @@
               <w:rPr>
                 <w:noProof/>
               </w:rPr>
-              <w:instrText xml:space="preserve"> PAGEREF _Toc243331432 \h </w:instrText>
+              <w:instrText xml:space="preserve"> PAGEREF _Toc243418997 \h </w:instrText>
             </w:r>
             <w:r>
               <w:rPr>
@@ -1537,7 +1537,7 @@
               <w:noProof/>
             </w:rPr>
           </w:pPr>
-          <w:hyperlink w:anchor="_Toc243331433" w:history="1">
+          <w:hyperlink w:anchor="_Toc243418998" w:history="1">
             <w:r>
               <w:rPr>
                 <w:rStyle w:val="Hyperlink"/>
@@ -1561,7 +1561,7 @@
               <w:rPr>
                 <w:noProof/>
               </w:rPr>
-              <w:instrText xml:space="preserve"> PAGEREF _Toc243331433 \h </w:instrText>
+              <w:instrText xml:space="preserve"> PAGEREF _Toc243418998 \h </w:instrText>
             </w:r>
             <w:r>
               <w:rPr>
@@ -1598,7 +1598,7 @@
               <w:noProof/>
             </w:rPr>
           </w:pPr>
-          <w:hyperlink w:anchor="_Toc243331434" w:history="1">
+          <w:hyperlink w:anchor="_Toc243418999" w:history="1">
             <w:r>
               <w:rPr>
                 <w:rStyle w:val="Hyperlink"/>
@@ -1622,7 +1622,7 @@
               <w:rPr>
                 <w:noProof/>
               </w:rPr>
-              <w:instrText xml:space="preserve"> PAGEREF _Toc243331434 \h </w:instrText>
+              <w:instrText xml:space="preserve"> PAGEREF _Toc243418999 \h </w:instrText>
             </w:r>
             <w:r>
               <w:rPr>
@@ -1659,7 +1659,7 @@
               <w:noProof/>
             </w:rPr>
           </w:pPr>
-          <w:hyperlink w:anchor="_Toc243331435" w:history="1">
+          <w:hyperlink w:anchor="_Toc243419000" w:history="1">
             <w:r>
               <w:rPr>
                 <w:rStyle w:val="Hyperlink"/>
@@ -1683,7 +1683,7 @@
               <w:rPr>
                 <w:noProof/>
               </w:rPr>
-              <w:instrText xml:space="preserve"> PAGEREF _Toc243331435 \h </w:instrText>
+              <w:instrText xml:space="preserve"> PAGEREF _Toc243419000 \h </w:instrText>
             </w:r>
             <w:r>
               <w:rPr>
@@ -1720,7 +1720,7 @@
               <w:noProof/>
             </w:rPr>
           </w:pPr>
-          <w:hyperlink w:anchor="_Toc243331436" w:history="1">
+          <w:hyperlink w:anchor="_Toc243419001" w:history="1">
             <w:r>
               <w:rPr>
                 <w:rStyle w:val="Hyperlink"/>
@@ -1744,7 +1744,7 @@
               <w:rPr>
                 <w:noProof/>
               </w:rPr>
-              <w:instrText xml:space="preserve"> PAGEREF _Toc243331436 \h </w:instrText>
+              <w:instrText xml:space="preserve"> PAGEREF _Toc243419001 \h </w:instrText>
             </w:r>
             <w:r>
               <w:rPr>
@@ -1781,7 +1781,7 @@
               <w:noProof/>
             </w:rPr>
           </w:pPr>
-          <w:hyperlink w:anchor="_Toc243331437" w:history="1">
+          <w:hyperlink w:anchor="_Toc243419002" w:history="1">
             <w:r>
               <w:rPr>
                 <w:rStyle w:val="Hyperlink"/>
@@ -1805,7 +1805,7 @@
               <w:rPr>
                 <w:noProof/>
               </w:rPr>
-              <w:instrText xml:space="preserve"> PAGEREF _Toc243331437 \h </w:instrText>
+              <w:instrText xml:space="preserve"> PAGEREF _Toc243419002 \h </w:instrText>
             </w:r>
             <w:r>
               <w:rPr>
@@ -1842,7 +1842,7 @@
               <w:noProof/>
             </w:rPr>
           </w:pPr>
-          <w:hyperlink w:anchor="_Toc243331438" w:history="1">
+          <w:hyperlink w:anchor="_Toc243419003" w:history="1">
             <w:r>
               <w:rPr>
                 <w:rStyle w:val="Hyperlink"/>
@@ -1866,7 +1866,7 @@
               <w:rPr>
                 <w:noProof/>
               </w:rPr>
-              <w:instrText xml:space="preserve"> PAGEREF _Toc243331438 \h </w:instrText>
+              <w:instrText xml:space="preserve"> PAGEREF _Toc243419003 \h </w:instrText>
             </w:r>
             <w:r>
               <w:rPr>
@@ -1903,7 +1903,7 @@
               <w:noProof/>
             </w:rPr>
           </w:pPr>
-          <w:hyperlink w:anchor="_Toc243331439" w:history="1">
+          <w:hyperlink w:anchor="_Toc243419004" w:history="1">
             <w:r>
               <w:rPr>
                 <w:rStyle w:val="Hyperlink"/>
@@ -1927,7 +1927,7 @@
               <w:rPr>
                 <w:noProof/>
               </w:rPr>
-              <w:instrText xml:space="preserve"> PAGEREF _Toc243331439 \h </w:instrText>
+              <w:instrText xml:space="preserve"> PAGEREF _Toc243419004 \h </w:instrText>
             </w:r>
             <w:r>
               <w:rPr>
@@ -1964,13 +1964,13 @@
               <w:noProof/>
             </w:rPr>
           </w:pPr>
-          <w:hyperlink w:anchor="_Toc243331440" w:history="1">
+          <w:hyperlink w:anchor="_Toc243419005" w:history="1">
             <w:r>
               <w:rPr>
                 <w:rStyle w:val="Hyperlink"/>
                 <w:noProof/>
               </w:rPr>
-              <w:t>11. Notifications and what runs in the background</w:t>
+              <w:t>11. From the landing page to a workspace</w:t>
             </w:r>
             <w:r>
               <w:rPr>
@@ -1988,7 +1988,7 @@
               <w:rPr>
                 <w:noProof/>
               </w:rPr>
-              <w:instrText xml:space="preserve"> PAGEREF _Toc243331440 \h </w:instrText>
+              <w:instrText xml:space="preserve"> PAGEREF _Toc243419005 \h </w:instrText>
             </w:r>
             <w:r>
               <w:rPr>
@@ -2025,13 +2025,13 @@
               <w:noProof/>
             </w:rPr>
           </w:pPr>
-          <w:hyperlink w:anchor="_Toc243331441" w:history="1">
+          <w:hyperlink w:anchor="_Toc243419006" w:history="1">
             <w:r>
               <w:rPr>
                 <w:rStyle w:val="Hyperlink"/>
                 <w:noProof/>
               </w:rPr>
-              <w:t>11.1 Who is told what</w:t>
+              <w:t>11.1 Plans</w:t>
             </w:r>
             <w:r>
               <w:rPr>
@@ -2049,7 +2049,7 @@
               <w:rPr>
                 <w:noProof/>
               </w:rPr>
-              <w:instrText xml:space="preserve"> PAGEREF _Toc243331441 \h </w:instrText>
+              <w:instrText xml:space="preserve"> PAGEREF _Toc243419006 \h </w:instrText>
             </w:r>
             <w:r>
               <w:rPr>
@@ -2086,13 +2086,13 @@
               <w:noProof/>
             </w:rPr>
           </w:pPr>
-          <w:hyperlink w:anchor="_Toc243331442" w:history="1">
+          <w:hyperlink w:anchor="_Toc243419007" w:history="1">
             <w:r>
               <w:rPr>
                 <w:rStyle w:val="Hyperlink"/>
                 <w:noProof/>
               </w:rPr>
-              <w:t>11.2 The scheduler</w:t>
+              <w:t>11.2 Step by step</w:t>
             </w:r>
             <w:r>
               <w:rPr>
@@ -2110,7 +2110,7 @@
               <w:rPr>
                 <w:noProof/>
               </w:rPr>
-              <w:instrText xml:space="preserve"> PAGEREF _Toc243331442 \h </w:instrText>
+              <w:instrText xml:space="preserve"> PAGEREF _Toc243419007 \h </w:instrText>
             </w:r>
             <w:r>
               <w:rPr>
@@ -2147,13 +2147,13 @@
               <w:noProof/>
             </w:rPr>
           </w:pPr>
-          <w:hyperlink w:anchor="_Toc243331443" w:history="1">
+          <w:hyperlink w:anchor="_Toc243419008" w:history="1">
             <w:r>
               <w:rPr>
                 <w:rStyle w:val="Hyperlink"/>
                 <w:noProof/>
               </w:rPr>
-              <w:t>12. A worked example: one buyer, start to finish</w:t>
+              <w:t>12. Notifications and what runs in the background</w:t>
             </w:r>
             <w:r>
               <w:rPr>
@@ -2171,7 +2171,7 @@
               <w:rPr>
                 <w:noProof/>
               </w:rPr>
-              <w:instrText xml:space="preserve"> PAGEREF _Toc243331443 \h </w:instrText>
+              <w:instrText xml:space="preserve"> PAGEREF _Toc243419008 \h </w:instrText>
             </w:r>
             <w:r>
               <w:rPr>
@@ -2189,6 +2189,128 @@
                 <w:noProof/>
               </w:rPr>
               <w:t>20</w:t>
+            </w:r>
+            <w:r>
+              <w:rPr>
+                <w:noProof/>
+              </w:rPr>
+              <w:fldChar w:fldCharType="end"/>
+            </w:r>
+          </w:hyperlink>
+        </w:p>
+        <w:p>
+          <w:pPr>
+            <w:pStyle w:val="TOC2"/>
+            <w:tabs>
+              <w:tab w:val="right" w:leader="dot" w:pos="9016"/>
+            </w:tabs>
+            <w:rPr>
+              <w:noProof/>
+            </w:rPr>
+          </w:pPr>
+          <w:hyperlink w:anchor="_Toc243419009" w:history="1">
+            <w:r>
+              <w:rPr>
+                <w:rStyle w:val="Hyperlink"/>
+                <w:noProof/>
+              </w:rPr>
+              <w:t>12.1 Who is told what</w:t>
+            </w:r>
+            <w:r>
+              <w:rPr>
+                <w:noProof/>
+              </w:rPr>
+              <w:tab/>
+            </w:r>
+            <w:r>
+              <w:rPr>
+                <w:noProof/>
+              </w:rPr>
+              <w:fldChar w:fldCharType="begin"/>
+            </w:r>
+            <w:r>
+              <w:rPr>
+                <w:noProof/>
+              </w:rPr>
+              <w:instrText xml:space="preserve"> PAGEREF _Toc243419009 \h </w:instrText>
+            </w:r>
+            <w:r>
+              <w:rPr>
+                <w:noProof/>
+              </w:rPr>
+            </w:r>
+            <w:r>
+              <w:rPr>
+                <w:noProof/>
+              </w:rPr>
+              <w:fldChar w:fldCharType="separate"/>
+            </w:r>
+            <w:r>
+              <w:rPr>
+                <w:noProof/>
+              </w:rPr>
+              <w:t>20</w:t>
+            </w:r>
+            <w:r>
+              <w:rPr>
+                <w:noProof/>
+              </w:rPr>
+              <w:fldChar w:fldCharType="end"/>
+            </w:r>
+          </w:hyperlink>
+        </w:p>
+        <w:p>
+          <w:pPr>
+            <w:pStyle w:val="TOC2"/>
+            <w:tabs>
+              <w:tab w:val="right" w:leader="dot" w:pos="9016"/>
+            </w:tabs>
+            <w:rPr>
+              <w:noProof/>
+            </w:rPr>
+          </w:pPr>
+          <w:hyperlink w:anchor="_Toc243419010" w:history="1">
+            <w:r>
+              <w:rPr>
+                <w:rStyle w:val="Hyperlink"/>
+                <w:noProof/>
+              </w:rPr>
+              <w:t>12.2 The scheduler</w:t>
+            </w:r>
+            <w:r>
+              <w:rPr>
+                <w:noProof/>
+              </w:rPr>
+              <w:tab/>
+            </w:r>
+            <w:r>
+              <w:rPr>
+                <w:noProof/>
+              </w:rPr>
+              <w:fldChar w:fldCharType="begin"/>
+            </w:r>
+            <w:r>
+              <w:rPr>
+                <w:noProof/>
+              </w:rPr>
+              <w:instrText xml:space="preserve"> PAGEREF _Toc243419010 \h </w:instrText>
+            </w:r>
+            <w:r>
+              <w:rPr>
+                <w:noProof/>
+              </w:rPr>
+            </w:r>
+            <w:r>
+              <w:rPr>
+                <w:noProof/>
+              </w:rPr>
+              <w:fldChar w:fldCharType="separate"/>
+            </w:r>
+            <w:r>
+              <w:rPr>
+                <w:noProof/>
+              </w:rPr>
+              <w:t>21</w:t>
             </w:r>
             <w:r>
               <w:rPr>
@@ -2208,13 +2330,13 @@
               <w:noProof/>
             </w:rPr>
           </w:pPr>
-          <w:hyperlink w:anchor="_Toc243331444" w:history="1">
+          <w:hyperlink w:anchor="_Toc243419011" w:history="1">
             <w:r>
               <w:rPr>
                 <w:rStyle w:val="Hyperlink"/>
                 <w:noProof/>
               </w:rPr>
-              <w:t>13. Rules the system always enforces</w:t>
+              <w:t>13. A worked example: one buyer, start to finish</w:t>
             </w:r>
             <w:r>
               <w:rPr>
@@ -2232,7 +2354,7 @@
               <w:rPr>
                 <w:noProof/>
               </w:rPr>
-              <w:instrText xml:space="preserve"> PAGEREF _Toc243331444 \h </w:instrText>
+              <w:instrText xml:space="preserve"> PAGEREF _Toc243419011 \h </w:instrText>
             </w:r>
             <w:r>
               <w:rPr>
@@ -2269,13 +2391,13 @@
               <w:noProof/>
             </w:rPr>
           </w:pPr>
-          <w:hyperlink w:anchor="_Toc243331445" w:history="1">
+          <w:hyperlink w:anchor="_Toc243419012" w:history="1">
             <w:r>
               <w:rPr>
                 <w:rStyle w:val="Hyperlink"/>
                 <w:noProof/>
               </w:rPr>
-              <w:t>14. Glossary</w:t>
+              <w:t>14. Rules the system always enforces</w:t>
             </w:r>
             <w:r>
               <w:rPr>
@@ -2293,7 +2415,7 @@
               <w:rPr>
                 <w:noProof/>
               </w:rPr>
-              <w:instrText xml:space="preserve"> PAGEREF _Toc243331445 \h </w:instrText>
+              <w:instrText xml:space="preserve"> PAGEREF _Toc243419012 \h </w:instrText>
             </w:r>
             <w:r>
               <w:rPr>
@@ -2310,7 +2432,68 @@
               <w:rPr>
                 <w:noProof/>
               </w:rPr>
-              <w:t>21</w:t>
+              <w:t>22</w:t>
+            </w:r>
+            <w:r>
+              <w:rPr>
+                <w:noProof/>
+              </w:rPr>
+              <w:fldChar w:fldCharType="end"/>
+            </w:r>
+          </w:hyperlink>
+        </w:p>
+        <w:p>
+          <w:pPr>
+            <w:pStyle w:val="TOC1"/>
+            <w:tabs>
+              <w:tab w:val="right" w:leader="dot" w:pos="9016"/>
+            </w:tabs>
+            <w:rPr>
+              <w:noProof/>
+            </w:rPr>
+          </w:pPr>
+          <w:hyperlink w:anchor="_Toc243419013" w:history="1">
+            <w:r>
+              <w:rPr>
+                <w:rStyle w:val="Hyperlink"/>
+                <w:noProof/>
+              </w:rPr>
+              <w:t>15. Glossary</w:t>
+            </w:r>
+            <w:r>
+              <w:rPr>
+                <w:noProof/>
+              </w:rPr>
+              <w:tab/>
+            </w:r>
+            <w:r>
+              <w:rPr>
+                <w:noProof/>
+              </w:rPr>
+              <w:fldChar w:fldCharType="begin"/>
+            </w:r>
+            <w:r>
+              <w:rPr>
+                <w:noProof/>
+              </w:rPr>
+              <w:instrText xml:space="preserve"> PAGEREF _Toc243419013 \h </w:instrText>
+            </w:r>
+            <w:r>
+              <w:rPr>
+                <w:noProof/>
+              </w:rPr>
+            </w:r>
+            <w:r>
+              <w:rPr>
+                <w:noProof/>
+              </w:rPr>
+              <w:fldChar w:fldCharType="separate"/>
+            </w:r>
+            <w:r>
+              <w:rPr>
+                <w:noProof/>
+              </w:rPr>
+              <w:t>23</w:t>
             </w:r>
             <w:r>
               <w:rPr>
@@ -2330,13 +2513,13 @@
               <w:noProof/>
             </w:rPr>
           </w:pPr>
-          <w:hyperlink w:anchor="_Toc243331446" w:history="1">
+          <w:hyperlink w:anchor="_Toc243419014" w:history="1">
             <w:r>
               <w:rPr>
                 <w:rStyle w:val="Hyperlink"/>
                 <w:noProof/>
               </w:rPr>
-              <w:t>14.1 Current status</w:t>
+              <w:t>15.1 Current status</w:t>
             </w:r>
             <w:r>
               <w:rPr>
@@ -2354,7 +2537,7 @@
               <w:rPr>
                 <w:noProof/>
               </w:rPr>
-              <w:instrText xml:space="preserve"> PAGEREF _Toc243331446 \h </w:instrText>
+              <w:instrText xml:space="preserve"> PAGEREF _Toc243419014 \h </w:instrText>
             </w:r>
             <w:r>
               <w:rPr>
@@ -2371,7 +2554,7 @@
               <w:rPr>
                 <w:noProof/>
               </w:rPr>
-              <w:t>22</w:t>
+              <w:t>23</w:t>
             </w:r>
             <w:r>
               <w:rPr>
@@ -2394,7 +2577,7 @@
         <w:keepLines/>
         <w:pageBreakBefore/>
       </w:pPr>
-      <w:bookmarkStart w:id="0" w:name="_Toc243331410"/>
+      <w:bookmarkStart w:id="0" w:name="_Toc243418975"/>
       <w:r>
         <w:t>1. Distrik in one minute</w:t>
       </w:r>
@@ -2484,7 +2667,7 @@
       <w:pPr>
         <w:pStyle w:val="Heading2"/>
       </w:pPr>
-      <w:bookmarkStart w:id="1" w:name="_Toc243331411"/>
+      <w:bookmarkStart w:id="1" w:name="_Toc243418976"/>
       <w:r>
         <w:t>1.1 Who uses Distrik</w:t>
       </w:r>
@@ -3271,7 +3454,7 @@
                 <w:sz w:val="19"/>
                 <w:szCs w:val="19"/>
               </w:rPr>
-              <w:t>Keep the platform healthy: queues and failed jobs, tenant setup, data-source compliance, WhatsApp template status</w:t>
+              <w:t>Keep the platform healthy: queues and failed jobs, activating signups, data-source compliance, WhatsApp template status</w:t>
             </w:r>
           </w:p>
         </w:tc>
@@ -3627,7 +3810,7 @@
         <w:pStyle w:val="Heading1"/>
         <w:keepLines/>
       </w:pPr>
-      <w:bookmarkStart w:id="2" w:name="_Toc243331412"/>
+      <w:bookmarkStart w:id="2" w:name="_Toc243418977"/>
       <w:r>
         <w:t>2. The big picture</w:t>
       </w:r>
@@ -3682,7 +3865,7 @@
           <w:noProof/>
         </w:rPr>
         <w:drawing>
-          <wp:inline distT="0" distB="0" distL="0" distR="0" wp14:anchorId="015E2564" wp14:editId="13CD2215">
+          <wp:inline distT="0" distB="0" distL="0" distR="0" wp14:anchorId="4BF12391" wp14:editId="7CEE534E">
             <wp:extent cx="5734050" cy="3038475"/>
             <wp:effectExtent l="0" t="0" r="0" b="0"/>
             <wp:docPr id="1" name="01_system_overview.png" descr="How the pieces connect" title="How the pieces connect"/>
@@ -3765,7 +3948,7 @@
         <w:pStyle w:val="Heading1"/>
         <w:keepLines/>
       </w:pPr>
-      <w:bookmarkStart w:id="3" w:name="_Toc243331413"/>
+      <w:bookmarkStart w:id="3" w:name="_Toc243418978"/>
       <w:r>
         <w:t>3. One deal, end to end</w:t>
       </w:r>
@@ -3790,7 +3973,7 @@
           <w:noProof/>
         </w:rPr>
         <w:drawing>
-          <wp:inline distT="0" distB="0" distL="0" distR="0" wp14:anchorId="3FA12E50" wp14:editId="257A7843">
+          <wp:inline distT="0" distB="0" distL="0" distR="0" wp14:anchorId="5DFECB2C" wp14:editId="12C5504C">
             <wp:extent cx="5734050" cy="3352800"/>
             <wp:effectExtent l="0" t="0" r="0" b="0"/>
             <wp:docPr id="2" name="02_deal_loop.png" descr="The deal loop: only exceptions reach you" title="The deal loop: only exceptions reach you"/>
@@ -5521,7 +5704,7 @@
       <w:pPr>
         <w:pStyle w:val="Heading2"/>
       </w:pPr>
-      <w:bookmarkStart w:id="4" w:name="_Toc243331414"/>
+      <w:bookmarkStart w:id="4" w:name="_Toc243418979"/>
       <w:r>
         <w:t>3.1 What the AI may do alone</w:t>
       </w:r>
@@ -5970,7 +6153,7 @@
         <w:pStyle w:val="Heading1"/>
         <w:keepLines/>
       </w:pPr>
-      <w:bookmarkStart w:id="5" w:name="_Toc243331415"/>
+      <w:bookmarkStart w:id="5" w:name="_Toc243418980"/>
       <w:r>
         <w:t>4. The manufacturer owner’s journey</w:t>
       </w:r>
@@ -5980,7 +6163,7 @@
       <w:pPr>
         <w:pStyle w:val="Heading2"/>
       </w:pPr>
-      <w:bookmarkStart w:id="6" w:name="_Toc243331416"/>
+      <w:bookmarkStart w:id="6" w:name="_Toc243418981"/>
       <w:r>
         <w:t>4.1 Signing in and the dashboard</w:t>
       </w:r>
@@ -6093,7 +6276,7 @@
       <w:pPr>
         <w:pStyle w:val="Heading2"/>
       </w:pPr>
-      <w:bookmarkStart w:id="7" w:name="_Toc243331417"/>
+      <w:bookmarkStart w:id="7" w:name="_Toc243418982"/>
       <w:r>
         <w:t>4.2 Products and the catalogue (the Product Brain)</w:t>
       </w:r>
@@ -6110,7 +6293,7 @@
           <w:noProof/>
         </w:rPr>
         <w:drawing>
-          <wp:inline distT="0" distB="0" distL="0" distR="0" wp14:anchorId="66645F2E" wp14:editId="33A4546F">
+          <wp:inline distT="0" distB="0" distL="0" distR="0" wp14:anchorId="36A62A02" wp14:editId="1FA6639F">
             <wp:extent cx="5734050" cy="2028825"/>
             <wp:effectExtent l="0" t="0" r="0" b="0"/>
             <wp:docPr id="3" name="03_product_brain.png" descr="From catalogue PDF to products the AI can sell" title="From catalogue PDF to products the AI can sell"/>
@@ -6239,7 +6422,7 @@
       <w:pPr>
         <w:pStyle w:val="Heading2"/>
       </w:pPr>
-      <w:bookmarkStart w:id="8" w:name="_Toc243331418"/>
+      <w:bookmarkStart w:id="8" w:name="_Toc243418983"/>
       <w:r>
         <w:t>4.3 Commercial rules: what the AI may offer</w:t>
       </w:r>
@@ -7657,7 +7840,7 @@
       <w:pPr>
         <w:pStyle w:val="Heading2"/>
       </w:pPr>
-      <w:bookmarkStart w:id="9" w:name="_Toc243331419"/>
+      <w:bookmarkStart w:id="9" w:name="_Toc243418984"/>
       <w:r>
         <w:t>4.4 Starting a campaign (Start Sales)</w:t>
       </w:r>
@@ -7674,7 +7857,7 @@
           <w:noProof/>
         </w:rPr>
         <w:drawing>
-          <wp:inline distT="0" distB="0" distL="0" distR="0" wp14:anchorId="4247EF4E" wp14:editId="5CB45A07">
+          <wp:inline distT="0" distB="0" distL="0" distR="0" wp14:anchorId="4D489CE2" wp14:editId="75B766EF">
             <wp:extent cx="5734050" cy="2733675"/>
             <wp:effectExtent l="0" t="0" r="0" b="0"/>
             <wp:docPr id="4" name="04_discovery.png" descr="From a sentence to a checked, scored list of buyers" title="From a sentence to a checked, scored list of buyers"/>
@@ -8660,7 +8843,7 @@
       <w:pPr>
         <w:pStyle w:val="Heading2"/>
       </w:pPr>
-      <w:bookmarkStart w:id="10" w:name="_Toc243331420"/>
+      <w:bookmarkStart w:id="10" w:name="_Toc243418985"/>
       <w:r>
         <w:t>4.5 Lead Review: your team decides who to contact</w:t>
       </w:r>
@@ -8677,7 +8860,7 @@
           <w:noProof/>
         </w:rPr>
         <w:drawing>
-          <wp:inline distT="0" distB="0" distL="0" distR="0" wp14:anchorId="0DEE9E74" wp14:editId="16418ECD">
+          <wp:inline distT="0" distB="0" distL="0" distR="0" wp14:anchorId="17F4E10D" wp14:editId="286A7DE0">
             <wp:extent cx="5734050" cy="2733675"/>
             <wp:effectExtent l="0" t="0" r="0" b="0"/>
             <wp:docPr id="5" name="10_lead_review.png" descr="Lead Review: every discovered buyer is decided by the manufacturer’s own team" title="Lead Review: every discovered buyer is decided by the manufacturer’s own team"/>
@@ -9676,7 +9859,7 @@
       <w:pPr>
         <w:pStyle w:val="Heading2"/>
       </w:pPr>
-      <w:bookmarkStart w:id="11" w:name="_Toc243331421"/>
+      <w:bookmarkStart w:id="11" w:name="_Toc243418986"/>
       <w:r>
         <w:t>4.6 The campaign page and launching outreach</w:t>
       </w:r>
@@ -9809,7 +9992,7 @@
       <w:pPr>
         <w:pStyle w:val="Heading2"/>
       </w:pPr>
-      <w:bookmarkStart w:id="12" w:name="_Toc243331422"/>
+      <w:bookmarkStart w:id="12" w:name="_Toc243418987"/>
       <w:r>
         <w:t>4.7 Approvals</w:t>
       </w:r>
@@ -9826,7 +10009,7 @@
           <w:noProof/>
         </w:rPr>
         <w:drawing>
-          <wp:inline distT="0" distB="0" distL="0" distR="0" wp14:anchorId="6C100CF6" wp14:editId="3ECE25F0">
+          <wp:inline distT="0" distB="0" distL="0" distR="0" wp14:anchorId="186BBF29" wp14:editId="789157FD">
             <wp:extent cx="5734050" cy="3000375"/>
             <wp:effectExtent l="0" t="0" r="0" b="0"/>
             <wp:docPr id="6" name="06_negotiation.png" descr="How a price request is decided" title="How a price request is decided"/>
@@ -10003,7 +10186,7 @@
       <w:pPr>
         <w:pStyle w:val="Heading2"/>
       </w:pPr>
-      <w:bookmarkStart w:id="13" w:name="_Toc243331423"/>
+      <w:bookmarkStart w:id="13" w:name="_Toc243418988"/>
       <w:r>
         <w:t>4.8 Pipeline</w:t>
       </w:r>
@@ -10020,7 +10203,7 @@
           <w:noProof/>
         </w:rPr>
         <w:drawing>
-          <wp:inline distT="0" distB="0" distL="0" distR="0" wp14:anchorId="059249AC" wp14:editId="58210B06">
+          <wp:inline distT="0" distB="0" distL="0" distR="0" wp14:anchorId="7AE98BC7" wp14:editId="6CA44FB2">
             <wp:extent cx="5734050" cy="1724025"/>
             <wp:effectExtent l="0" t="0" r="0" b="0"/>
             <wp:docPr id="7" name="08_stages.png" descr="The eight pipeline stages and what moves a buyer between them" title="The eight pipeline stages and what moves a buyer between them"/>
@@ -10087,7 +10270,7 @@
       <w:pPr>
         <w:pStyle w:val="Heading2"/>
       </w:pPr>
-      <w:bookmarkStart w:id="14" w:name="_Toc243331424"/>
+      <w:bookmarkStart w:id="14" w:name="_Toc243418989"/>
       <w:r>
         <w:t>4.9 Quotations, purchase orders and orders</w:t>
       </w:r>
@@ -10104,7 +10287,7 @@
           <w:noProof/>
         </w:rPr>
         <w:drawing>
-          <wp:inline distT="0" distB="0" distL="0" distR="0" wp14:anchorId="06B0C039" wp14:editId="45CAF26B">
+          <wp:inline distT="0" distB="0" distL="0" distR="0" wp14:anchorId="769249FC" wp14:editId="652D3F28">
             <wp:extent cx="5734050" cy="2209800"/>
             <wp:effectExtent l="0" t="0" r="0" b="0"/>
             <wp:docPr id="8" name="07_quote_to_order.png" descr="From an agreed price to a confirmed order" title="From an agreed price to a confirmed order"/>
@@ -10252,7 +10435,7 @@
       <w:pPr>
         <w:pStyle w:val="Heading2"/>
       </w:pPr>
-      <w:bookmarkStart w:id="15" w:name="_Toc243331425"/>
+      <w:bookmarkStart w:id="15" w:name="_Toc243418990"/>
       <w:r>
         <w:t>4.10 Orders, analytics and settings</w:t>
       </w:r>
@@ -10945,7 +11128,7 @@
         <w:pStyle w:val="Heading1"/>
         <w:keepLines/>
       </w:pPr>
-      <w:bookmarkStart w:id="16" w:name="_Toc243331426"/>
+      <w:bookmarkStart w:id="16" w:name="_Toc243418991"/>
       <w:r>
         <w:t>5. The sales head</w:t>
       </w:r>
@@ -11761,7 +11944,7 @@
         <w:pStyle w:val="Heading1"/>
         <w:keepLines/>
       </w:pPr>
-      <w:bookmarkStart w:id="17" w:name="_Toc243331427"/>
+      <w:bookmarkStart w:id="17" w:name="_Toc243418992"/>
       <w:r>
         <w:t>6. The sales rep (seller in the field)</w:t>
       </w:r>
@@ -11796,7 +11979,7 @@
           <w:noProof/>
         </w:rPr>
         <w:drawing>
-          <wp:inline distT="0" distB="0" distL="0" distR="0" wp14:anchorId="15C2D70E" wp14:editId="6EC0E1F1">
+          <wp:inline distT="0" distB="0" distL="0" distR="0" wp14:anchorId="13DCD00E" wp14:editId="1926597E">
             <wp:extent cx="5734050" cy="2647950"/>
             <wp:effectExtent l="0" t="0" r="0" b="0"/>
             <wp:docPr id="9" name="09_rep_flow.png" descr="A rep’s day, including offline work" title="A rep’s day, including offline work"/>
@@ -11855,7 +12038,7 @@
       <w:pPr>
         <w:pStyle w:val="Heading2"/>
       </w:pPr>
-      <w:bookmarkStart w:id="18" w:name="_Toc243331428"/>
+      <w:bookmarkStart w:id="18" w:name="_Toc243418993"/>
       <w:r>
         <w:t>6.1 Screens</w:t>
       </w:r>
@@ -12287,7 +12470,7 @@
       <w:pPr>
         <w:pStyle w:val="Heading2"/>
       </w:pPr>
-      <w:bookmarkStart w:id="19" w:name="_Toc243331429"/>
+      <w:bookmarkStart w:id="19" w:name="_Toc243418994"/>
       <w:r>
         <w:t>6.2 Working with buyers who have no consent</w:t>
       </w:r>
@@ -12333,7 +12516,7 @@
       <w:pPr>
         <w:pStyle w:val="Heading2"/>
       </w:pPr>
-      <w:bookmarkStart w:id="20" w:name="_Toc243331430"/>
+      <w:bookmarkStart w:id="20" w:name="_Toc243418995"/>
       <w:r>
         <w:t>6.3 Taking over from the AI</w:t>
       </w:r>
@@ -12371,7 +12554,7 @@
       <w:pPr>
         <w:pStyle w:val="Heading2"/>
       </w:pPr>
-      <w:bookmarkStart w:id="21" w:name="_Toc243331431"/>
+      <w:bookmarkStart w:id="21" w:name="_Toc243418996"/>
       <w:r>
         <w:t>6.4 Working offline</w:t>
       </w:r>
@@ -12390,7 +12573,7 @@
         <w:pStyle w:val="Heading1"/>
         <w:keepLines/>
       </w:pPr>
-      <w:bookmarkStart w:id="22" w:name="_Toc243331432"/>
+      <w:bookmarkStart w:id="22" w:name="_Toc243418997"/>
       <w:r>
         <w:t>7. The buyer’s experience</w:t>
       </w:r>
@@ -12408,7 +12591,7 @@
       <w:pPr>
         <w:pStyle w:val="Heading2"/>
       </w:pPr>
-      <w:bookmarkStart w:id="23" w:name="_Toc243331433"/>
+      <w:bookmarkStart w:id="23" w:name="_Toc243418998"/>
       <w:r>
         <w:t>7.1 Consent decides what can be sent</w:t>
       </w:r>
@@ -12958,7 +13141,7 @@
       <w:pPr>
         <w:pStyle w:val="Heading2"/>
       </w:pPr>
-      <w:bookmarkStart w:id="24" w:name="_Toc243331434"/>
+      <w:bookmarkStart w:id="24" w:name="_Toc243418999"/>
       <w:r>
         <w:t>7.2 What a conversation looks like</w:t>
       </w:r>
@@ -13659,7 +13842,7 @@
         <w:pStyle w:val="Heading1"/>
         <w:keepLines/>
       </w:pPr>
-      <w:bookmarkStart w:id="25" w:name="_Toc243331435"/>
+      <w:bookmarkStart w:id="25" w:name="_Toc243419000"/>
       <w:r>
         <w:t>8. How the AI sales agent works</w:t>
       </w:r>
@@ -13684,7 +13867,7 @@
           <w:noProof/>
         </w:rPr>
         <w:drawing>
-          <wp:inline distT="0" distB="0" distL="0" distR="0" wp14:anchorId="78A8BAAE" wp14:editId="7C0EA735">
+          <wp:inline distT="0" distB="0" distL="0" distR="0" wp14:anchorId="6F43F749" wp14:editId="1D72946C">
             <wp:extent cx="5734050" cy="2590800"/>
             <wp:effectExtent l="0" t="0" r="0" b="0"/>
             <wp:docPr id="10" name="05_conversation.png" descr="From a buyer’s message to a reply, with every check" title="From a buyer’s message to a reply, with every check"/>
@@ -13743,7 +13926,7 @@
       <w:pPr>
         <w:pStyle w:val="Heading2"/>
       </w:pPr>
-      <w:bookmarkStart w:id="26" w:name="_Toc243331436"/>
+      <w:bookmarkStart w:id="26" w:name="_Toc243419001"/>
       <w:r>
         <w:t>8.1 The AI’s tools</w:t>
       </w:r>
@@ -14370,7 +14553,7 @@
       <w:pPr>
         <w:pStyle w:val="Heading2"/>
       </w:pPr>
-      <w:bookmarkStart w:id="27" w:name="_Toc243331437"/>
+      <w:bookmarkStart w:id="27" w:name="_Toc243419002"/>
       <w:r>
         <w:t>8.2 Guardrails</w:t>
       </w:r>
@@ -14494,7 +14677,7 @@
         <w:pStyle w:val="Heading1"/>
         <w:keepLines/>
       </w:pPr>
-      <w:bookmarkStart w:id="28" w:name="_Toc243331438"/>
+      <w:bookmarkStart w:id="28" w:name="_Toc243419003"/>
       <w:r>
         <w:t>9. Reorders: keeping customers buying</w:t>
       </w:r>
@@ -14511,7 +14694,7 @@
           <w:noProof/>
         </w:rPr>
         <w:drawing>
-          <wp:inline distT="0" distB="0" distL="0" distR="0" wp14:anchorId="5931A226" wp14:editId="60267C6C">
+          <wp:inline distT="0" distB="0" distL="0" distR="0" wp14:anchorId="4FB4B219" wp14:editId="62215221">
             <wp:extent cx="5734050" cy="1590675"/>
             <wp:effectExtent l="0" t="0" r="0" b="0"/>
             <wp:docPr id="11" name="11_reorder.png" descr="How a reorder is predicted and followed up" title="How a reorder is predicted and followed up"/>
@@ -14599,7 +14782,7 @@
         <w:pStyle w:val="Heading1"/>
         <w:keepLines/>
       </w:pPr>
-      <w:bookmarkStart w:id="29" w:name="_Toc243331439"/>
+      <w:bookmarkStart w:id="29" w:name="_Toc243419004"/>
       <w:r>
         <w:t>10. The system admin (platform maintenance only)</w:t>
       </w:r>
@@ -14864,6 +15047,101 @@
                 <w:sz w:val="19"/>
                 <w:szCs w:val="19"/>
               </w:rPr>
+              <w:t>Applications</w:t>
+            </w:r>
+          </w:p>
+        </w:tc>
+        <w:tc>
+          <w:tcPr>
+            <w:tcW w:w="4212" w:type="dxa"/>
+            <w:tcBorders>
+              <w:top w:val="single" w:sz="4" w:space="0" w:color="D9D9D2"/>
+              <w:left w:val="single" w:sz="4" w:space="0" w:color="D9D9D2"/>
+              <w:bottom w:val="single" w:sz="4" w:space="0" w:color="D9D9D2"/>
+              <w:right w:val="single" w:sz="4" w:space="0" w:color="D9D9D2"/>
+            </w:tcBorders>
+            <w:tcMar>
+              <w:top w:w="70" w:type="dxa"/>
+              <w:left w:w="110" w:type="dxa"/>
+              <w:bottom w:w="70" w:type="dxa"/>
+              <w:right w:w="110" w:type="dxa"/>
+            </w:tcMar>
+            <w:vAlign w:val="center"/>
+          </w:tcPr>
+          <w:p>
+            <w:pPr>
+              <w:spacing w:line="252" w:lineRule="auto"/>
+            </w:pPr>
+            <w:r>
+              <w:rPr>
+                <w:sz w:val="19"/>
+                <w:szCs w:val="19"/>
+              </w:rPr>
+              <w:t>Review self-serve signups; Activate (records the payment) or Reject with a reason</w:t>
+            </w:r>
+          </w:p>
+        </w:tc>
+        <w:tc>
+          <w:tcPr>
+            <w:tcW w:w="3209" w:type="dxa"/>
+            <w:tcBorders>
+              <w:top w:val="single" w:sz="4" w:space="0" w:color="D9D9D2"/>
+              <w:left w:val="single" w:sz="4" w:space="0" w:color="D9D9D2"/>
+              <w:bottom w:val="single" w:sz="4" w:space="0" w:color="D9D9D2"/>
+              <w:right w:val="single" w:sz="4" w:space="0" w:color="D9D9D2"/>
+            </w:tcBorders>
+            <w:tcMar>
+              <w:top w:w="70" w:type="dxa"/>
+              <w:left w:w="110" w:type="dxa"/>
+              <w:bottom w:w="70" w:type="dxa"/>
+              <w:right w:w="110" w:type="dxa"/>
+            </w:tcMar>
+            <w:vAlign w:val="center"/>
+          </w:tcPr>
+          <w:p>
+            <w:pPr>
+              <w:spacing w:line="252" w:lineRule="auto"/>
+            </w:pPr>
+            <w:r>
+              <w:rPr>
+                <w:sz w:val="19"/>
+                <w:szCs w:val="19"/>
+              </w:rPr>
+              <w:t>Company, owner contact, plan and payment status of applicants</w:t>
+            </w:r>
+          </w:p>
+        </w:tc>
+      </w:tr>
+      <w:tr>
+        <w:trPr>
+          <w:cantSplit/>
+        </w:trPr>
+        <w:tc>
+          <w:tcPr>
+            <w:tcW w:w="1605" w:type="dxa"/>
+            <w:tcBorders>
+              <w:top w:val="single" w:sz="4" w:space="0" w:color="D9D9D2"/>
+              <w:left w:val="single" w:sz="4" w:space="0" w:color="D9D9D2"/>
+              <w:bottom w:val="single" w:sz="4" w:space="0" w:color="D9D9D2"/>
+              <w:right w:val="single" w:sz="4" w:space="0" w:color="D9D9D2"/>
+            </w:tcBorders>
+            <w:tcMar>
+              <w:top w:w="70" w:type="dxa"/>
+              <w:left w:w="110" w:type="dxa"/>
+              <w:bottom w:w="70" w:type="dxa"/>
+              <w:right w:w="110" w:type="dxa"/>
+            </w:tcMar>
+            <w:vAlign w:val="center"/>
+          </w:tcPr>
+          <w:p>
+            <w:pPr>
+              <w:spacing w:line="252" w:lineRule="auto"/>
+            </w:pPr>
+            <w:r>
+              <w:rPr>
+                <w:sz w:val="19"/>
+                <w:szCs w:val="19"/>
+              </w:rPr>
               <w:t>Tenants</w:t>
             </w:r>
           </w:p>
@@ -14894,7 +15172,7 @@
                 <w:sz w:val="19"/>
                 <w:szCs w:val="19"/>
               </w:rPr>
-              <w:t>Create a manufacturer and invite its owner</w:t>
+              <w:t>List manufacturers with their plan; connect a tenant’s WhatsApp number</w:t>
             </w:r>
           </w:p>
         </w:tc>
@@ -15177,21 +15455,877 @@
         <w:pStyle w:val="Heading1"/>
         <w:keepLines/>
       </w:pPr>
-      <w:bookmarkStart w:id="30" w:name="_Toc243331440"/>
-      <w:r>
-        <w:t>11. Notifications and what runs in the background</w:t>
+      <w:bookmarkStart w:id="30" w:name="_Toc243419005"/>
+      <w:r>
+        <w:t>11. From the landing page to a workspace</w:t>
       </w:r>
       <w:bookmarkEnd w:id="30"/>
+    </w:p>
+    <w:p>
+      <w:pPr>
+        <w:spacing w:after="120" w:line="288" w:lineRule="auto"/>
+      </w:pPr>
+      <w:r>
+        <w:t>Manufacturers now sign themselves up. Anyone can open the Distrik website, see what the product does and how, read the policies, join the waitlist, compare the three plans and apply. The system admin no longer types tenant details in.</w:t>
+      </w:r>
+    </w:p>
+    <w:p>
+      <w:pPr>
+        <w:keepNext/>
+        <w:spacing w:before="120" w:after="60"/>
+        <w:jc w:val="center"/>
+      </w:pPr>
+      <w:r>
+        <w:rPr>
+          <w:noProof/>
+        </w:rPr>
+        <w:drawing>
+          <wp:inline distT="0" distB="0" distL="0" distR="0" wp14:anchorId="3358AF27" wp14:editId="6C444BF9">
+            <wp:extent cx="5734050" cy="2400300"/>
+            <wp:effectExtent l="0" t="0" r="0" b="0"/>
+            <wp:docPr id="12" name="12_signup.png" descr="Self-serve signup: the manufacturer applies, activation creates the workspace" title="Self-serve signup: the manufacturer applies, activation creates the workspace"/>
+            <wp:cNvGraphicFramePr>
+              <a:graphicFrameLocks xmlns:a="http://schemas.openxmlformats.org/drawingml/2006/main" noChangeAspect="1"/>
+            </wp:cNvGraphicFramePr>
+            <a:graphic xmlns:a="http://schemas.openxmlformats.org/drawingml/2006/main">
+              <a:graphicData uri="http://schemas.openxmlformats.org/drawingml/2006/picture">
+                <pic:pic xmlns:pic="http://schemas.openxmlformats.org/drawingml/2006/picture">
+                  <pic:nvPicPr>
+                    <pic:cNvPr id="0" name=""/>
+                    <pic:cNvPicPr>
+                      <a:picLocks noChangeAspect="1" noChangeArrowheads="1"/>
+                    </pic:cNvPicPr>
+                  </pic:nvPicPr>
+                  <pic:blipFill>
+                    <a:blip r:embed="rId18"/>
+                    <a:srcRect/>
+                    <a:stretch>
+                      <a:fillRect/>
+                    </a:stretch>
+                  </pic:blipFill>
+                  <pic:spPr bwMode="auto">
+                    <a:xfrm>
+                      <a:off x="0" y="0"/>
+                      <a:ext cx="5734050" cy="2400300"/>
+                    </a:xfrm>
+                    <a:prstGeom prst="rect">
+                      <a:avLst/>
+                    </a:prstGeom>
+                  </pic:spPr>
+                </pic:pic>
+              </a:graphicData>
+            </a:graphic>
+          </wp:inline>
+        </w:drawing>
+      </w:r>
+    </w:p>
+    <w:p>
+      <w:pPr>
+        <w:spacing w:after="200"/>
+        <w:jc w:val="center"/>
+      </w:pPr>
+      <w:r>
+        <w:rPr>
+          <w:i/>
+          <w:iCs/>
+          <w:color w:val="63655E"/>
+          <w:sz w:val="18"/>
+          <w:szCs w:val="18"/>
+        </w:rPr>
+        <w:t>Figure 12. Self-serve signup: the manufacturer applies, activation creates the workspace</w:t>
+      </w:r>
     </w:p>
     <w:p>
       <w:pPr>
         <w:pStyle w:val="Heading2"/>
       </w:pPr>
-      <w:bookmarkStart w:id="31" w:name="_Toc243331441"/>
-      <w:r>
-        <w:t>11.1 Who is told what</w:t>
+      <w:bookmarkStart w:id="31" w:name="_Toc243419006"/>
+      <w:r>
+        <w:t>11.1 Plans</w:t>
       </w:r>
       <w:bookmarkEnd w:id="31"/>
+    </w:p>
+    <w:tbl>
+      <w:tblPr>
+        <w:tblW w:w="9026" w:type="dxa"/>
+        <w:tblBorders>
+          <w:top w:val="single" w:sz="4" w:space="0" w:color="auto"/>
+          <w:left w:val="single" w:sz="4" w:space="0" w:color="auto"/>
+          <w:bottom w:val="single" w:sz="4" w:space="0" w:color="auto"/>
+          <w:right w:val="single" w:sz="4" w:space="0" w:color="auto"/>
+          <w:insideH w:val="single" w:sz="4" w:space="0" w:color="auto"/>
+          <w:insideV w:val="single" w:sz="4" w:space="0" w:color="auto"/>
+        </w:tblBorders>
+        <w:tblLayout w:type="fixed"/>
+        <w:tblLook w:val="04A0" w:firstRow="1" w:lastRow="0" w:firstColumn="1" w:lastColumn="0" w:noHBand="0" w:noVBand="1"/>
+      </w:tblPr>
+      <w:tblGrid>
+        <w:gridCol w:w="2006"/>
+        <w:gridCol w:w="1605"/>
+        <w:gridCol w:w="1605"/>
+        <w:gridCol w:w="3810"/>
+      </w:tblGrid>
+      <w:tr>
+        <w:trPr>
+          <w:tblHeader/>
+        </w:trPr>
+        <w:tc>
+          <w:tcPr>
+            <w:tcW w:w="2006" w:type="dxa"/>
+            <w:tcBorders>
+              <w:top w:val="single" w:sz="4" w:space="0" w:color="D9D9D2"/>
+              <w:left w:val="single" w:sz="4" w:space="0" w:color="D9D9D2"/>
+              <w:bottom w:val="single" w:sz="4" w:space="0" w:color="D9D9D2"/>
+              <w:right w:val="single" w:sz="4" w:space="0" w:color="D9D9D2"/>
+            </w:tcBorders>
+            <w:shd w:val="clear" w:color="auto" w:fill="0F766E"/>
+            <w:tcMar>
+              <w:top w:w="70" w:type="dxa"/>
+              <w:left w:w="110" w:type="dxa"/>
+              <w:bottom w:w="70" w:type="dxa"/>
+              <w:right w:w="110" w:type="dxa"/>
+            </w:tcMar>
+            <w:vAlign w:val="center"/>
+          </w:tcPr>
+          <w:p>
+            <w:pPr>
+              <w:spacing w:line="252" w:lineRule="auto"/>
+            </w:pPr>
+            <w:r>
+              <w:rPr>
+                <w:b/>
+                <w:bCs/>
+                <w:color w:val="FFFFFF"/>
+                <w:sz w:val="19"/>
+                <w:szCs w:val="19"/>
+              </w:rPr>
+              <w:t>Plan</w:t>
+            </w:r>
+          </w:p>
+        </w:tc>
+        <w:tc>
+          <w:tcPr>
+            <w:tcW w:w="1605" w:type="dxa"/>
+            <w:tcBorders>
+              <w:top w:val="single" w:sz="4" w:space="0" w:color="D9D9D2"/>
+              <w:left w:val="single" w:sz="4" w:space="0" w:color="D9D9D2"/>
+              <w:bottom w:val="single" w:sz="4" w:space="0" w:color="D9D9D2"/>
+              <w:right w:val="single" w:sz="4" w:space="0" w:color="D9D9D2"/>
+            </w:tcBorders>
+            <w:shd w:val="clear" w:color="auto" w:fill="0F766E"/>
+            <w:tcMar>
+              <w:top w:w="70" w:type="dxa"/>
+              <w:left w:w="110" w:type="dxa"/>
+              <w:bottom w:w="70" w:type="dxa"/>
+              <w:right w:w="110" w:type="dxa"/>
+            </w:tcMar>
+            <w:vAlign w:val="center"/>
+          </w:tcPr>
+          <w:p>
+            <w:pPr>
+              <w:spacing w:line="252" w:lineRule="auto"/>
+            </w:pPr>
+            <w:r>
+              <w:rPr>
+                <w:b/>
+                <w:bCs/>
+                <w:color w:val="FFFFFF"/>
+                <w:sz w:val="19"/>
+                <w:szCs w:val="19"/>
+              </w:rPr>
+              <w:t>Monthly (+ GST)</w:t>
+            </w:r>
+          </w:p>
+        </w:tc>
+        <w:tc>
+          <w:tcPr>
+            <w:tcW w:w="1605" w:type="dxa"/>
+            <w:tcBorders>
+              <w:top w:val="single" w:sz="4" w:space="0" w:color="D9D9D2"/>
+              <w:left w:val="single" w:sz="4" w:space="0" w:color="D9D9D2"/>
+              <w:bottom w:val="single" w:sz="4" w:space="0" w:color="D9D9D2"/>
+              <w:right w:val="single" w:sz="4" w:space="0" w:color="D9D9D2"/>
+            </w:tcBorders>
+            <w:shd w:val="clear" w:color="auto" w:fill="0F766E"/>
+            <w:tcMar>
+              <w:top w:w="70" w:type="dxa"/>
+              <w:left w:w="110" w:type="dxa"/>
+              <w:bottom w:w="70" w:type="dxa"/>
+              <w:right w:w="110" w:type="dxa"/>
+            </w:tcMar>
+            <w:vAlign w:val="center"/>
+          </w:tcPr>
+          <w:p>
+            <w:pPr>
+              <w:spacing w:line="252" w:lineRule="auto"/>
+            </w:pPr>
+            <w:r>
+              <w:rPr>
+                <w:b/>
+                <w:bCs/>
+                <w:color w:val="FFFFFF"/>
+                <w:sz w:val="19"/>
+                <w:szCs w:val="19"/>
+              </w:rPr>
+              <w:t>Yearly (+ GST)</w:t>
+            </w:r>
+          </w:p>
+        </w:tc>
+        <w:tc>
+          <w:tcPr>
+            <w:tcW w:w="3810" w:type="dxa"/>
+            <w:tcBorders>
+              <w:top w:val="single" w:sz="4" w:space="0" w:color="D9D9D2"/>
+              <w:left w:val="single" w:sz="4" w:space="0" w:color="D9D9D2"/>
+              <w:bottom w:val="single" w:sz="4" w:space="0" w:color="D9D9D2"/>
+              <w:right w:val="single" w:sz="4" w:space="0" w:color="D9D9D2"/>
+            </w:tcBorders>
+            <w:shd w:val="clear" w:color="auto" w:fill="0F766E"/>
+            <w:tcMar>
+              <w:top w:w="70" w:type="dxa"/>
+              <w:left w:w="110" w:type="dxa"/>
+              <w:bottom w:w="70" w:type="dxa"/>
+              <w:right w:w="110" w:type="dxa"/>
+            </w:tcMar>
+            <w:vAlign w:val="center"/>
+          </w:tcPr>
+          <w:p>
+            <w:pPr>
+              <w:spacing w:line="252" w:lineRule="auto"/>
+            </w:pPr>
+            <w:r>
+              <w:rPr>
+                <w:b/>
+                <w:bCs/>
+                <w:color w:val="FFFFFF"/>
+                <w:sz w:val="19"/>
+                <w:szCs w:val="19"/>
+              </w:rPr>
+              <w:t>Included (shown, not enforced yet)</w:t>
+            </w:r>
+          </w:p>
+        </w:tc>
+      </w:tr>
+      <w:tr>
+        <w:trPr>
+          <w:cantSplit/>
+        </w:trPr>
+        <w:tc>
+          <w:tcPr>
+            <w:tcW w:w="2006" w:type="dxa"/>
+            <w:tcBorders>
+              <w:top w:val="single" w:sz="4" w:space="0" w:color="D9D9D2"/>
+              <w:left w:val="single" w:sz="4" w:space="0" w:color="D9D9D2"/>
+              <w:bottom w:val="single" w:sz="4" w:space="0" w:color="D9D9D2"/>
+              <w:right w:val="single" w:sz="4" w:space="0" w:color="D9D9D2"/>
+            </w:tcBorders>
+            <w:tcMar>
+              <w:top w:w="70" w:type="dxa"/>
+              <w:left w:w="110" w:type="dxa"/>
+              <w:bottom w:w="70" w:type="dxa"/>
+              <w:right w:w="110" w:type="dxa"/>
+            </w:tcMar>
+            <w:vAlign w:val="center"/>
+          </w:tcPr>
+          <w:p>
+            <w:pPr>
+              <w:spacing w:line="252" w:lineRule="auto"/>
+            </w:pPr>
+            <w:r>
+              <w:rPr>
+                <w:sz w:val="19"/>
+                <w:szCs w:val="19"/>
+              </w:rPr>
+              <w:t>Basic</w:t>
+            </w:r>
+          </w:p>
+        </w:tc>
+        <w:tc>
+          <w:tcPr>
+            <w:tcW w:w="1605" w:type="dxa"/>
+            <w:tcBorders>
+              <w:top w:val="single" w:sz="4" w:space="0" w:color="D9D9D2"/>
+              <w:left w:val="single" w:sz="4" w:space="0" w:color="D9D9D2"/>
+              <w:bottom w:val="single" w:sz="4" w:space="0" w:color="D9D9D2"/>
+              <w:right w:val="single" w:sz="4" w:space="0" w:color="D9D9D2"/>
+            </w:tcBorders>
+            <w:tcMar>
+              <w:top w:w="70" w:type="dxa"/>
+              <w:left w:w="110" w:type="dxa"/>
+              <w:bottom w:w="70" w:type="dxa"/>
+              <w:right w:w="110" w:type="dxa"/>
+            </w:tcMar>
+            <w:vAlign w:val="center"/>
+          </w:tcPr>
+          <w:p>
+            <w:pPr>
+              <w:spacing w:line="252" w:lineRule="auto"/>
+            </w:pPr>
+            <w:r>
+              <w:rPr>
+                <w:sz w:val="19"/>
+                <w:szCs w:val="19"/>
+              </w:rPr>
+              <w:t>₹</w:t>
+            </w:r>
+            <w:r>
+              <w:rPr>
+                <w:sz w:val="19"/>
+                <w:szCs w:val="19"/>
+              </w:rPr>
+              <w:t>5,000</w:t>
+            </w:r>
+          </w:p>
+        </w:tc>
+        <w:tc>
+          <w:tcPr>
+            <w:tcW w:w="1605" w:type="dxa"/>
+            <w:tcBorders>
+              <w:top w:val="single" w:sz="4" w:space="0" w:color="D9D9D2"/>
+              <w:left w:val="single" w:sz="4" w:space="0" w:color="D9D9D2"/>
+              <w:bottom w:val="single" w:sz="4" w:space="0" w:color="D9D9D2"/>
+              <w:right w:val="single" w:sz="4" w:space="0" w:color="D9D9D2"/>
+            </w:tcBorders>
+            <w:tcMar>
+              <w:top w:w="70" w:type="dxa"/>
+              <w:left w:w="110" w:type="dxa"/>
+              <w:bottom w:w="70" w:type="dxa"/>
+              <w:right w:w="110" w:type="dxa"/>
+            </w:tcMar>
+            <w:vAlign w:val="center"/>
+          </w:tcPr>
+          <w:p>
+            <w:pPr>
+              <w:spacing w:line="252" w:lineRule="auto"/>
+            </w:pPr>
+            <w:r>
+              <w:rPr>
+                <w:sz w:val="19"/>
+                <w:szCs w:val="19"/>
+              </w:rPr>
+              <w:t>₹</w:t>
+            </w:r>
+            <w:r>
+              <w:rPr>
+                <w:sz w:val="19"/>
+                <w:szCs w:val="19"/>
+              </w:rPr>
+              <w:t>48,000</w:t>
+            </w:r>
+          </w:p>
+        </w:tc>
+        <w:tc>
+          <w:tcPr>
+            <w:tcW w:w="3810" w:type="dxa"/>
+            <w:tcBorders>
+              <w:top w:val="single" w:sz="4" w:space="0" w:color="D9D9D2"/>
+              <w:left w:val="single" w:sz="4" w:space="0" w:color="D9D9D2"/>
+              <w:bottom w:val="single" w:sz="4" w:space="0" w:color="D9D9D2"/>
+              <w:right w:val="single" w:sz="4" w:space="0" w:color="D9D9D2"/>
+            </w:tcBorders>
+            <w:tcMar>
+              <w:top w:w="70" w:type="dxa"/>
+              <w:left w:w="110" w:type="dxa"/>
+              <w:bottom w:w="70" w:type="dxa"/>
+              <w:right w:w="110" w:type="dxa"/>
+            </w:tcMar>
+            <w:vAlign w:val="center"/>
+          </w:tcPr>
+          <w:p>
+            <w:pPr>
+              <w:spacing w:line="252" w:lineRule="auto"/>
+            </w:pPr>
+            <w:r>
+              <w:rPr>
+                <w:sz w:val="19"/>
+                <w:szCs w:val="19"/>
+              </w:rPr>
+              <w:t>3 team seats, 1 active campaign, 100 prospects a month</w:t>
+            </w:r>
+          </w:p>
+        </w:tc>
+      </w:tr>
+      <w:tr>
+        <w:trPr>
+          <w:cantSplit/>
+        </w:trPr>
+        <w:tc>
+          <w:tcPr>
+            <w:tcW w:w="2006" w:type="dxa"/>
+            <w:tcBorders>
+              <w:top w:val="single" w:sz="4" w:space="0" w:color="D9D9D2"/>
+              <w:left w:val="single" w:sz="4" w:space="0" w:color="D9D9D2"/>
+              <w:bottom w:val="single" w:sz="4" w:space="0" w:color="D9D9D2"/>
+              <w:right w:val="single" w:sz="4" w:space="0" w:color="D9D9D2"/>
+            </w:tcBorders>
+            <w:tcMar>
+              <w:top w:w="70" w:type="dxa"/>
+              <w:left w:w="110" w:type="dxa"/>
+              <w:bottom w:w="70" w:type="dxa"/>
+              <w:right w:w="110" w:type="dxa"/>
+            </w:tcMar>
+            <w:vAlign w:val="center"/>
+          </w:tcPr>
+          <w:p>
+            <w:pPr>
+              <w:spacing w:line="252" w:lineRule="auto"/>
+            </w:pPr>
+            <w:r>
+              <w:rPr>
+                <w:sz w:val="19"/>
+                <w:szCs w:val="19"/>
+              </w:rPr>
+              <w:t>Growth (most popular)</w:t>
+            </w:r>
+          </w:p>
+        </w:tc>
+        <w:tc>
+          <w:tcPr>
+            <w:tcW w:w="1605" w:type="dxa"/>
+            <w:tcBorders>
+              <w:top w:val="single" w:sz="4" w:space="0" w:color="D9D9D2"/>
+              <w:left w:val="single" w:sz="4" w:space="0" w:color="D9D9D2"/>
+              <w:bottom w:val="single" w:sz="4" w:space="0" w:color="D9D9D2"/>
+              <w:right w:val="single" w:sz="4" w:space="0" w:color="D9D9D2"/>
+            </w:tcBorders>
+            <w:tcMar>
+              <w:top w:w="70" w:type="dxa"/>
+              <w:left w:w="110" w:type="dxa"/>
+              <w:bottom w:w="70" w:type="dxa"/>
+              <w:right w:w="110" w:type="dxa"/>
+            </w:tcMar>
+            <w:vAlign w:val="center"/>
+          </w:tcPr>
+          <w:p>
+            <w:pPr>
+              <w:spacing w:line="252" w:lineRule="auto"/>
+            </w:pPr>
+            <w:r>
+              <w:rPr>
+                <w:sz w:val="19"/>
+                <w:szCs w:val="19"/>
+              </w:rPr>
+              <w:t>₹</w:t>
+            </w:r>
+            <w:r>
+              <w:rPr>
+                <w:sz w:val="19"/>
+                <w:szCs w:val="19"/>
+              </w:rPr>
+              <w:t>9,000</w:t>
+            </w:r>
+          </w:p>
+        </w:tc>
+        <w:tc>
+          <w:tcPr>
+            <w:tcW w:w="1605" w:type="dxa"/>
+            <w:tcBorders>
+              <w:top w:val="single" w:sz="4" w:space="0" w:color="D9D9D2"/>
+              <w:left w:val="single" w:sz="4" w:space="0" w:color="D9D9D2"/>
+              <w:bottom w:val="single" w:sz="4" w:space="0" w:color="D9D9D2"/>
+              <w:right w:val="single" w:sz="4" w:space="0" w:color="D9D9D2"/>
+            </w:tcBorders>
+            <w:tcMar>
+              <w:top w:w="70" w:type="dxa"/>
+              <w:left w:w="110" w:type="dxa"/>
+              <w:bottom w:w="70" w:type="dxa"/>
+              <w:right w:w="110" w:type="dxa"/>
+            </w:tcMar>
+            <w:vAlign w:val="center"/>
+          </w:tcPr>
+          <w:p>
+            <w:pPr>
+              <w:spacing w:line="252" w:lineRule="auto"/>
+            </w:pPr>
+            <w:r>
+              <w:rPr>
+                <w:sz w:val="19"/>
+                <w:szCs w:val="19"/>
+              </w:rPr>
+              <w:t>₹</w:t>
+            </w:r>
+            <w:r>
+              <w:rPr>
+                <w:sz w:val="19"/>
+                <w:szCs w:val="19"/>
+              </w:rPr>
+              <w:t>86,400</w:t>
+            </w:r>
+          </w:p>
+        </w:tc>
+        <w:tc>
+          <w:tcPr>
+            <w:tcW w:w="3810" w:type="dxa"/>
+            <w:tcBorders>
+              <w:top w:val="single" w:sz="4" w:space="0" w:color="D9D9D2"/>
+              <w:left w:val="single" w:sz="4" w:space="0" w:color="D9D9D2"/>
+              <w:bottom w:val="single" w:sz="4" w:space="0" w:color="D9D9D2"/>
+              <w:right w:val="single" w:sz="4" w:space="0" w:color="D9D9D2"/>
+            </w:tcBorders>
+            <w:tcMar>
+              <w:top w:w="70" w:type="dxa"/>
+              <w:left w:w="110" w:type="dxa"/>
+              <w:bottom w:w="70" w:type="dxa"/>
+              <w:right w:w="110" w:type="dxa"/>
+            </w:tcMar>
+            <w:vAlign w:val="center"/>
+          </w:tcPr>
+          <w:p>
+            <w:pPr>
+              <w:spacing w:line="252" w:lineRule="auto"/>
+            </w:pPr>
+            <w:r>
+              <w:rPr>
+                <w:sz w:val="19"/>
+                <w:szCs w:val="19"/>
+              </w:rPr>
+              <w:t>10 team seats, 3 active campaigns, 400 prospects a month</w:t>
+            </w:r>
+          </w:p>
+        </w:tc>
+      </w:tr>
+      <w:tr>
+        <w:trPr>
+          <w:cantSplit/>
+        </w:trPr>
+        <w:tc>
+          <w:tcPr>
+            <w:tcW w:w="2006" w:type="dxa"/>
+            <w:tcBorders>
+              <w:top w:val="single" w:sz="4" w:space="0" w:color="D9D9D2"/>
+              <w:left w:val="single" w:sz="4" w:space="0" w:color="D9D9D2"/>
+              <w:bottom w:val="single" w:sz="4" w:space="0" w:color="D9D9D2"/>
+              <w:right w:val="single" w:sz="4" w:space="0" w:color="D9D9D2"/>
+            </w:tcBorders>
+            <w:tcMar>
+              <w:top w:w="70" w:type="dxa"/>
+              <w:left w:w="110" w:type="dxa"/>
+              <w:bottom w:w="70" w:type="dxa"/>
+              <w:right w:w="110" w:type="dxa"/>
+            </w:tcMar>
+            <w:vAlign w:val="center"/>
+          </w:tcPr>
+          <w:p>
+            <w:pPr>
+              <w:spacing w:line="252" w:lineRule="auto"/>
+            </w:pPr>
+            <w:r>
+              <w:rPr>
+                <w:sz w:val="19"/>
+                <w:szCs w:val="19"/>
+              </w:rPr>
+              <w:t>Scale</w:t>
+            </w:r>
+          </w:p>
+        </w:tc>
+        <w:tc>
+          <w:tcPr>
+            <w:tcW w:w="1605" w:type="dxa"/>
+            <w:tcBorders>
+              <w:top w:val="single" w:sz="4" w:space="0" w:color="D9D9D2"/>
+              <w:left w:val="single" w:sz="4" w:space="0" w:color="D9D9D2"/>
+              <w:bottom w:val="single" w:sz="4" w:space="0" w:color="D9D9D2"/>
+              <w:right w:val="single" w:sz="4" w:space="0" w:color="D9D9D2"/>
+            </w:tcBorders>
+            <w:tcMar>
+              <w:top w:w="70" w:type="dxa"/>
+              <w:left w:w="110" w:type="dxa"/>
+              <w:bottom w:w="70" w:type="dxa"/>
+              <w:right w:w="110" w:type="dxa"/>
+            </w:tcMar>
+            <w:vAlign w:val="center"/>
+          </w:tcPr>
+          <w:p>
+            <w:pPr>
+              <w:spacing w:line="252" w:lineRule="auto"/>
+            </w:pPr>
+            <w:r>
+              <w:rPr>
+                <w:sz w:val="19"/>
+                <w:szCs w:val="19"/>
+              </w:rPr>
+              <w:t>₹</w:t>
+            </w:r>
+            <w:r>
+              <w:rPr>
+                <w:sz w:val="19"/>
+                <w:szCs w:val="19"/>
+              </w:rPr>
+              <w:t>20,000</w:t>
+            </w:r>
+          </w:p>
+        </w:tc>
+        <w:tc>
+          <w:tcPr>
+            <w:tcW w:w="1605" w:type="dxa"/>
+            <w:tcBorders>
+              <w:top w:val="single" w:sz="4" w:space="0" w:color="D9D9D2"/>
+              <w:left w:val="single" w:sz="4" w:space="0" w:color="D9D9D2"/>
+              <w:bottom w:val="single" w:sz="4" w:space="0" w:color="D9D9D2"/>
+              <w:right w:val="single" w:sz="4" w:space="0" w:color="D9D9D2"/>
+            </w:tcBorders>
+            <w:tcMar>
+              <w:top w:w="70" w:type="dxa"/>
+              <w:left w:w="110" w:type="dxa"/>
+              <w:bottom w:w="70" w:type="dxa"/>
+              <w:right w:w="110" w:type="dxa"/>
+            </w:tcMar>
+            <w:vAlign w:val="center"/>
+          </w:tcPr>
+          <w:p>
+            <w:pPr>
+              <w:spacing w:line="252" w:lineRule="auto"/>
+            </w:pPr>
+            <w:r>
+              <w:rPr>
+                <w:sz w:val="19"/>
+                <w:szCs w:val="19"/>
+              </w:rPr>
+              <w:t>₹</w:t>
+            </w:r>
+            <w:r>
+              <w:rPr>
+                <w:sz w:val="19"/>
+                <w:szCs w:val="19"/>
+              </w:rPr>
+              <w:t>1,92,000</w:t>
+            </w:r>
+          </w:p>
+        </w:tc>
+        <w:tc>
+          <w:tcPr>
+            <w:tcW w:w="3810" w:type="dxa"/>
+            <w:tcBorders>
+              <w:top w:val="single" w:sz="4" w:space="0" w:color="D9D9D2"/>
+              <w:left w:val="single" w:sz="4" w:space="0" w:color="D9D9D2"/>
+              <w:bottom w:val="single" w:sz="4" w:space="0" w:color="D9D9D2"/>
+              <w:right w:val="single" w:sz="4" w:space="0" w:color="D9D9D2"/>
+            </w:tcBorders>
+            <w:tcMar>
+              <w:top w:w="70" w:type="dxa"/>
+              <w:left w:w="110" w:type="dxa"/>
+              <w:bottom w:w="70" w:type="dxa"/>
+              <w:right w:w="110" w:type="dxa"/>
+            </w:tcMar>
+            <w:vAlign w:val="center"/>
+          </w:tcPr>
+          <w:p>
+            <w:pPr>
+              <w:spacing w:line="252" w:lineRule="auto"/>
+            </w:pPr>
+            <w:r>
+              <w:rPr>
+                <w:sz w:val="19"/>
+                <w:szCs w:val="19"/>
+              </w:rPr>
+              <w:t>25 team seats, unlimited campaigns, 1,500 prospects a month</w:t>
+            </w:r>
+          </w:p>
+        </w:tc>
+      </w:tr>
+    </w:tbl>
+    <w:p>
+      <w:pPr>
+        <w:spacing w:after="120"/>
+      </w:pPr>
+    </w:p>
+    <w:p>
+      <w:pPr>
+        <w:pStyle w:val="Heading2"/>
+      </w:pPr>
+      <w:bookmarkStart w:id="32" w:name="_Toc243419007"/>
+      <w:r>
+        <w:t>11.2 Step by step</w:t>
+      </w:r>
+      <w:bookmarkEnd w:id="32"/>
+    </w:p>
+    <w:p>
+      <w:pPr>
+        <w:pStyle w:val="ListParagraph"/>
+        <w:numPr>
+          <w:ilvl w:val="0"/>
+          <w:numId w:val="5"/>
+        </w:numPr>
+        <w:spacing w:after="60" w:line="276" w:lineRule="auto"/>
+      </w:pPr>
+      <w:r>
+        <w:rPr>
+          <w:b/>
+          <w:bCs/>
+        </w:rPr>
+        <w:t>Landing page.</w:t>
+      </w:r>
+      <w:r>
+        <w:t xml:space="preserve"> The visitor reads the product tour, how it works, the policies and the FAQ. The live waitlist counter is the only social proof. Joining the waitlist needs only an email.</w:t>
+      </w:r>
+    </w:p>
+    <w:p>
+      <w:pPr>
+        <w:pStyle w:val="ListParagraph"/>
+        <w:numPr>
+          <w:ilvl w:val="0"/>
+          <w:numId w:val="5"/>
+        </w:numPr>
+        <w:spacing w:after="60" w:line="276" w:lineRule="auto"/>
+      </w:pPr>
+      <w:r>
+        <w:rPr>
+          <w:b/>
+          <w:bCs/>
+        </w:rPr>
+        <w:t>Choose a plan.</w:t>
+      </w:r>
+      <w:r>
+        <w:t xml:space="preserve"> Basic, Growth or Scale, monthly or yearly (yearly is 20% cheaper). The price is frozen when the application is submitted.</w:t>
+      </w:r>
+    </w:p>
+    <w:p>
+      <w:pPr>
+        <w:pStyle w:val="ListParagraph"/>
+        <w:numPr>
+          <w:ilvl w:val="0"/>
+          <w:numId w:val="5"/>
+        </w:numPr>
+        <w:spacing w:after="60" w:line="276" w:lineRule="auto"/>
+      </w:pPr>
+      <w:r>
+        <w:rPr>
+          <w:b/>
+          <w:bCs/>
+        </w:rPr>
+        <w:t>Fill in the tenant form.</w:t>
+      </w:r>
+      <w:r>
+        <w:t xml:space="preserve"> Company (name, state, optional GSTIN checked against the state, city, address, phones, WhatsApp number) and owner (name, email, mobile), then accept the Terms, Privacy and Refund policies. The database checks every field again.</w:t>
+      </w:r>
+    </w:p>
+    <w:p>
+      <w:pPr>
+        <w:pStyle w:val="ListParagraph"/>
+        <w:numPr>
+          <w:ilvl w:val="0"/>
+          <w:numId w:val="5"/>
+        </w:numPr>
+        <w:spacing w:after="60" w:line="276" w:lineRule="auto"/>
+      </w:pPr>
+      <w:r>
+        <w:rPr>
+          <w:b/>
+          <w:bCs/>
+        </w:rPr>
+        <w:t>Payment step.</w:t>
+      </w:r>
+      <w:r>
+        <w:t xml:space="preserve"> Online payment is not live yet, so the page says “coming soon” and nothing is charged. Submitting adds the manufacturer to the waitlist (the counter goes up by one) and shows a private status page with their position.</w:t>
+      </w:r>
+    </w:p>
+    <w:p>
+      <w:pPr>
+        <w:pStyle w:val="ListParagraph"/>
+        <w:numPr>
+          <w:ilvl w:val="0"/>
+          <w:numId w:val="5"/>
+        </w:numPr>
+        <w:spacing w:after="60" w:line="276" w:lineRule="auto"/>
+      </w:pPr>
+      <w:r>
+        <w:rPr>
+          <w:b/>
+          <w:bCs/>
+        </w:rPr>
+        <w:t>Activation.</w:t>
+      </w:r>
+      <w:r>
+        <w:t xml:space="preserve"> The system admin opens Applications and presses Activate, recording how the payment was received. This creates the manufacturer with conservative default guardrails, its subscription, and the owner account.</w:t>
+      </w:r>
+    </w:p>
+    <w:p>
+      <w:pPr>
+        <w:pStyle w:val="ListParagraph"/>
+        <w:numPr>
+          <w:ilvl w:val="0"/>
+          <w:numId w:val="5"/>
+        </w:numPr>
+        <w:spacing w:after="60" w:line="276" w:lineRule="auto"/>
+      </w:pPr>
+      <w:r>
+        <w:rPr>
+          <w:b/>
+          <w:bCs/>
+        </w:rPr>
+        <w:t>Email and first sign in.</w:t>
+      </w:r>
+      <w:r>
+        <w:t xml:space="preserve"> The owner receives “Your Distrik workspace is ready” with a link. It opens a welcome page to set a password, then the owner dashboard. From here the existing flow (section 4) continues unchanged.</w:t>
+      </w:r>
+    </w:p>
+    <w:tbl>
+      <w:tblPr>
+        <w:tblW w:w="9026" w:type="dxa"/>
+        <w:tblBorders>
+          <w:top w:val="single" w:sz="4" w:space="0" w:color="auto"/>
+          <w:left w:val="single" w:sz="4" w:space="0" w:color="auto"/>
+          <w:bottom w:val="single" w:sz="4" w:space="0" w:color="auto"/>
+          <w:right w:val="single" w:sz="4" w:space="0" w:color="auto"/>
+          <w:insideH w:val="single" w:sz="4" w:space="0" w:color="auto"/>
+          <w:insideV w:val="single" w:sz="4" w:space="0" w:color="auto"/>
+        </w:tblBorders>
+        <w:tblLook w:val="04A0" w:firstRow="1" w:lastRow="0" w:firstColumn="1" w:lastColumn="0" w:noHBand="0" w:noVBand="1"/>
+      </w:tblPr>
+      <w:tblGrid>
+        <w:gridCol w:w="9026"/>
+      </w:tblGrid>
+      <w:tr>
+        <w:tc>
+          <w:tcPr>
+            <w:tcW w:w="9026" w:type="dxa"/>
+            <w:tcBorders>
+              <w:left w:val="single" w:sz="24" w:space="0" w:color="0F766E"/>
+            </w:tcBorders>
+            <w:shd w:val="clear" w:color="auto" w:fill="E3F3F1"/>
+            <w:tcMar>
+              <w:top w:w="120" w:type="dxa"/>
+              <w:left w:w="180" w:type="dxa"/>
+              <w:bottom w:w="120" w:type="dxa"/>
+              <w:right w:w="180" w:type="dxa"/>
+            </w:tcMar>
+          </w:tcPr>
+          <w:p>
+            <w:pPr>
+              <w:spacing w:line="276" w:lineRule="auto"/>
+            </w:pPr>
+            <w:r>
+              <w:t>When a payment gateway is added, a successful payment will trigger the same activation automatically, with no admin click. Plan limits are displayed in Settings → Plan &amp; billing but are not enforced yet, and the policy pages are drafts pending legal review.</w:t>
+            </w:r>
+          </w:p>
+        </w:tc>
+      </w:tr>
+    </w:tbl>
+    <w:p>
+      <w:pPr>
+        <w:spacing w:after="80"/>
+      </w:pPr>
+    </w:p>
+    <w:p>
+      <w:pPr>
+        <w:pStyle w:val="Heading1"/>
+        <w:keepLines/>
+      </w:pPr>
+      <w:bookmarkStart w:id="33" w:name="_Toc243419008"/>
+      <w:r>
+        <w:t>12. Notifications and what runs in the background</w:t>
+      </w:r>
+      <w:bookmarkEnd w:id="33"/>
+    </w:p>
+    <w:p>
+      <w:pPr>
+        <w:pStyle w:val="Heading2"/>
+      </w:pPr>
+      <w:bookmarkStart w:id="34" w:name="_Toc243419009"/>
+      <w:r>
+        <w:t>12.1 Who is told what</w:t>
+      </w:r>
+      <w:bookmarkEnd w:id="34"/>
     </w:p>
     <w:tbl>
       <w:tblPr>
@@ -16279,11 +17413,11 @@
       <w:pPr>
         <w:pStyle w:val="Heading2"/>
       </w:pPr>
-      <w:bookmarkStart w:id="32" w:name="_Toc243331442"/>
-      <w:r>
-        <w:t>11.2 The scheduler</w:t>
-      </w:r>
-      <w:bookmarkEnd w:id="32"/>
+      <w:bookmarkStart w:id="35" w:name="_Toc243419010"/>
+      <w:r>
+        <w:t>12.2 The scheduler</w:t>
+      </w:r>
+      <w:bookmarkEnd w:id="35"/>
     </w:p>
     <w:tbl>
       <w:tblPr>
@@ -17000,11 +18134,11 @@
         <w:pStyle w:val="Heading1"/>
         <w:keepLines/>
       </w:pPr>
-      <w:bookmarkStart w:id="33" w:name="_Toc243331443"/>
-      <w:r>
-        <w:t>12. A worked example: one buyer, start to finish</w:t>
-      </w:r>
-      <w:bookmarkEnd w:id="33"/>
+      <w:bookmarkStart w:id="36" w:name="_Toc243419011"/>
+      <w:r>
+        <w:t>13. A worked example: one buyer, start to finish</w:t>
+      </w:r>
+      <w:bookmarkEnd w:id="36"/>
     </w:p>
     <w:p>
       <w:pPr>
@@ -18291,11 +19425,11 @@
         <w:pStyle w:val="Heading1"/>
         <w:keepLines/>
       </w:pPr>
-      <w:bookmarkStart w:id="34" w:name="_Toc243331444"/>
-      <w:r>
-        <w:t>13. Rules the system always enforces</w:t>
-      </w:r>
-      <w:bookmarkEnd w:id="34"/>
+      <w:bookmarkStart w:id="37" w:name="_Toc243419012"/>
+      <w:r>
+        <w:t>14. Rules the system always enforces</w:t>
+      </w:r>
+      <w:bookmarkEnd w:id="37"/>
     </w:p>
     <w:tbl>
       <w:tblPr>
@@ -19309,11 +20443,11 @@
         <w:pStyle w:val="Heading1"/>
         <w:keepLines/>
       </w:pPr>
-      <w:bookmarkStart w:id="35" w:name="_Toc243331445"/>
-      <w:r>
-        <w:t>14. Glossary</w:t>
-      </w:r>
-      <w:bookmarkEnd w:id="35"/>
+      <w:bookmarkStart w:id="38" w:name="_Toc243419013"/>
+      <w:r>
+        <w:t>15. Glossary</w:t>
+      </w:r>
+      <w:bookmarkEnd w:id="38"/>
     </w:p>
     <w:tbl>
       <w:tblPr>
@@ -20526,11 +21660,11 @@
       <w:pPr>
         <w:pStyle w:val="Heading2"/>
       </w:pPr>
-      <w:bookmarkStart w:id="36" w:name="_Toc243331446"/>
-      <w:r>
-        <w:t>14.1 Current status</w:t>
-      </w:r>
-      <w:bookmarkEnd w:id="36"/>
+      <w:bookmarkStart w:id="39" w:name="_Toc243419014"/>
+      <w:r>
+        <w:t>15.1 Current status</w:t>
+      </w:r>
+      <w:bookmarkEnd w:id="39"/>
     </w:p>
     <w:p>
       <w:pPr>
@@ -20605,8 +21739,8 @@
       </w:r>
     </w:p>
     <w:sectPr>
-      <w:headerReference w:type="default" r:id="rId18"/>
-      <w:footerReference w:type="default" r:id="rId19"/>
+      <w:headerReference w:type="default" r:id="rId19"/>
+      <w:footerReference w:type="default" r:id="rId20"/>
       <w:pgSz w:w="11906" w:h="16838"/>
       <w:pgMar w:top="1440" w:right="1440" w:bottom="1440" w:left="1440" w:header="708" w:footer="708" w:gutter="0"/>
       <w:cols w:space="720"/>
@@ -20783,10 +21917,64 @@
 <file path=word/numbering.xml><?xml version="1.0" encoding="utf-8"?>
 <w:numbering xmlns:wpc="http://schemas.microsoft.com/office/word/2010/wordprocessingCanvas" xmlns:cx="http://schemas.microsoft.com/office/drawing/2014/chartex" xmlns:cx1="http://schemas.microsoft.com/office/drawing/2015/9/8/chartex" xmlns:cx2="http://schemas.microsoft.com/office/drawing/2015/10/21/chartex" xmlns:cx3="http://schemas.microsoft.com/office/drawing/2016/5/9/chartex" xmlns:cx4="http://schemas.microsoft.com/office/drawing/2016/5/10/chartex" xmlns:cx5="http://schemas.microsoft.com/office/drawing/2016/5/11/chartex" xmlns:cx6="http://schemas.microsoft.com/office/drawing/2016/5/12/chartex" xmlns:cx7="http://schemas.microsoft.com/office/drawing/2016/5/13/chartex" xmlns:cx8="http://schemas.microsoft.com/office/drawing/2016/5/14/chartex" xmlns:mc="http://schemas.openxmlformats.org/markup-compatibility/2006" xmlns:aink="http://schemas.microsoft.com/office/drawing/2016/ink" xmlns:am3d="http://schemas.microsoft.com/office/drawing/2017/model3d" xmlns:o="urn:schemas-microsoft-com:office:office" xmlns:oel="http://schemas.microsoft.com/office/2019/extlst" xmlns:r="http://schemas.openxmlformats.org/officeDocument/2006/relationships" xmlns:m="http://schemas.openxmlformats.org/officeDocument/2006/math" xmlns:v="urn:schemas-microsoft-com:vml" xmlns:wp14="http://schemas.microsoft.com/office/word/2010/wordprocessingDrawing" xmlns:wp="http://schemas.openxmlformats.org/drawingml/2006/wordprocessingDrawing" xmlns:w10="urn:schemas-microsoft-com:office:word" xmlns:w="http://schemas.openxmlformats.org/wordprocessingml/2006/main" xmlns:w14="http://schemas.microsoft.com/office/word/2010/wordml" xmlns:w15="http://schemas.microsoft.com/office/word/2012/wordml" xmlns:w16cex="http://schemas.microsoft.com/office/word/2018/wordml/cex" xmlns:w16cid="http://schemas.microsoft.com/office/word/2016/wordml/cid" xmlns:w16="http://schemas.microsoft.com/office/word/2018/wordml" xmlns:w16du="http://schemas.microsoft.com/office/word/2023/wordml/word16du" xmlns:w16sdtdh="http://schemas.microsoft.com/office/word/2020/wordml/sdtdatahash" xmlns:w16sdtfl="http://schemas.microsoft.com/office/word/2024/wordml/sdtformatlock" xmlns:w16se="http://schemas.microsoft.com/office/word/2015/wordml/symex" xmlns:wpg="http://schemas.microsoft.com/office/word/2010/wordprocessingGroup" xmlns:wpi="http://schemas.microsoft.com/office/word/2010/wordprocessingInk" xmlns:wne="http://schemas.microsoft.com/office/word/2006/wordml" xmlns:wps="http://schemas.microsoft.com/office/word/2010/wordprocessingShape" mc:Ignorable="w14 w15 w16se w16cid w16 w16cex w16sdtdh w16sdtfl w16du wp14">
   <w:abstractNum w:abstractNumId="0" w15:restartNumberingAfterBreak="0">
-    <w:nsid w:val="1B60672B"/>
+    <w:nsid w:val="0E9C2A1F"/>
     <w:multiLevelType w:val="hybridMultilevel"/>
-    <w:tmpl w:val="3810497C"/>
-    <w:lvl w:ilvl="0" w:tplc="7FFA0FFE">
+    <w:tmpl w:val="29EC88B8"/>
+    <w:lvl w:ilvl="0" w:tplc="7C0AF95A">
+      <w:start w:val="1"/>
+      <w:numFmt w:val="decimal"/>
+      <w:lvlText w:val="%1."/>
+      <w:lvlJc w:val="left"/>
+      <w:pPr>
+        <w:ind w:left="540" w:hanging="300"/>
+      </w:pPr>
+    </w:lvl>
+    <w:lvl w:ilvl="1" w:tplc="988A7984">
+      <w:numFmt w:val="decimal"/>
+      <w:lvlText w:val=""/>
+      <w:lvlJc w:val="left"/>
+    </w:lvl>
+    <w:lvl w:ilvl="2" w:tplc="308CE1D0">
+      <w:numFmt w:val="decimal"/>
+      <w:lvlText w:val=""/>
+      <w:lvlJc w:val="left"/>
+    </w:lvl>
+    <w:lvl w:ilvl="3" w:tplc="8F6A725A">
+      <w:numFmt w:val="decimal"/>
+      <w:lvlText w:val=""/>
+      <w:lvlJc w:val="left"/>
+    </w:lvl>
+    <w:lvl w:ilvl="4" w:tplc="721E4F42">
+      <w:numFmt w:val="decimal"/>
+      <w:lvlText w:val=""/>
+      <w:lvlJc w:val="left"/>
+    </w:lvl>
+    <w:lvl w:ilvl="5" w:tplc="1E32C59A">
+      <w:numFmt w:val="decimal"/>
+      <w:lvlText w:val=""/>
+      <w:lvlJc w:val="left"/>
+    </w:lvl>
+    <w:lvl w:ilvl="6" w:tplc="4E64CF2A">
+      <w:numFmt w:val="decimal"/>
+      <w:lvlText w:val=""/>
+      <w:lvlJc w:val="left"/>
+    </w:lvl>
+    <w:lvl w:ilvl="7" w:tplc="050CF114">
+      <w:numFmt w:val="decimal"/>
+      <w:lvlText w:val=""/>
+      <w:lvlJc w:val="left"/>
+    </w:lvl>
+    <w:lvl w:ilvl="8" w:tplc="21A4FE04">
+      <w:numFmt w:val="decimal"/>
+      <w:lvlText w:val=""/>
+      <w:lvlJc w:val="left"/>
+    </w:lvl>
+  </w:abstractNum>
+  <w:abstractNum w:abstractNumId="1" w15:restartNumberingAfterBreak="0">
+    <w:nsid w:val="3DCB650F"/>
+    <w:multiLevelType w:val="hybridMultilevel"/>
+    <w:tmpl w:val="78EC9C22"/>
+    <w:lvl w:ilvl="0" w:tplc="4DCAC39C">
       <w:start w:val="1"/>
       <w:numFmt w:val="bullet"/>
       <w:lvlText w:val="•"/>
@@ -20795,7 +21983,7 @@
         <w:ind w:left="540" w:hanging="300"/>
       </w:pPr>
     </w:lvl>
-    <w:lvl w:ilvl="1" w:tplc="FCBE8E56" w:tentative="1">
+    <w:lvl w:ilvl="1" w:tplc="BBB24340" w:tentative="1">
       <w:start w:val="1"/>
       <w:numFmt w:val="bullet"/>
       <w:lvlText w:val="–"/>
@@ -20804,47 +21992,47 @@
         <w:ind w:left="1080" w:hanging="300"/>
       </w:pPr>
     </w:lvl>
-    <w:lvl w:ilvl="2" w:tplc="2122A008">
+    <w:lvl w:ilvl="2" w:tplc="7952CC9A">
       <w:numFmt w:val="decimal"/>
       <w:lvlText w:val=""/>
       <w:lvlJc w:val="left"/>
     </w:lvl>
-    <w:lvl w:ilvl="3" w:tplc="DC80AF4A">
+    <w:lvl w:ilvl="3" w:tplc="DFFE9F4E">
       <w:numFmt w:val="decimal"/>
       <w:lvlText w:val=""/>
       <w:lvlJc w:val="left"/>
     </w:lvl>
-    <w:lvl w:ilvl="4" w:tplc="2E4C8290">
+    <w:lvl w:ilvl="4" w:tplc="08DC6248">
       <w:numFmt w:val="decimal"/>
       <w:lvlText w:val=""/>
       <w:lvlJc w:val="left"/>
     </w:lvl>
-    <w:lvl w:ilvl="5" w:tplc="582C074E">
+    <w:lvl w:ilvl="5" w:tplc="DABC0EEC">
       <w:numFmt w:val="decimal"/>
       <w:lvlText w:val=""/>
       <w:lvlJc w:val="left"/>
     </w:lvl>
-    <w:lvl w:ilvl="6" w:tplc="97C87E14">
+    <w:lvl w:ilvl="6" w:tplc="BA804960">
       <w:numFmt w:val="decimal"/>
       <w:lvlText w:val=""/>
       <w:lvlJc w:val="left"/>
     </w:lvl>
-    <w:lvl w:ilvl="7" w:tplc="5FF253C8">
+    <w:lvl w:ilvl="7" w:tplc="53E4B650">
       <w:numFmt w:val="decimal"/>
       <w:lvlText w:val=""/>
       <w:lvlJc w:val="left"/>
     </w:lvl>
-    <w:lvl w:ilvl="8" w:tplc="7812BEEC">
+    <w:lvl w:ilvl="8" w:tplc="88D6FCA6">
       <w:numFmt w:val="decimal"/>
       <w:lvlText w:val=""/>
       <w:lvlJc w:val="left"/>
     </w:lvl>
   </w:abstractNum>
-  <w:abstractNum w:abstractNumId="1" w15:restartNumberingAfterBreak="0">
-    <w:nsid w:val="56CB5FEA"/>
+  <w:abstractNum w:abstractNumId="2" w15:restartNumberingAfterBreak="0">
+    <w:nsid w:val="6C996C6B"/>
     <w:multiLevelType w:val="hybridMultilevel"/>
-    <w:tmpl w:val="DFE2A3E8"/>
-    <w:lvl w:ilvl="0" w:tplc="9460A6AA">
+    <w:tmpl w:val="44F82F84"/>
+    <w:lvl w:ilvl="0" w:tplc="3A5A082C">
       <w:start w:val="1"/>
       <w:numFmt w:val="decimal"/>
       <w:lvlText w:val="%1."/>
@@ -20853,106 +22041,52 @@
         <w:ind w:left="540" w:hanging="300"/>
       </w:pPr>
     </w:lvl>
-    <w:lvl w:ilvl="1" w:tplc="53AA2142">
+    <w:lvl w:ilvl="1" w:tplc="BE985E70">
       <w:numFmt w:val="decimal"/>
       <w:lvlText w:val=""/>
       <w:lvlJc w:val="left"/>
     </w:lvl>
-    <w:lvl w:ilvl="2" w:tplc="3098BAD4">
+    <w:lvl w:ilvl="2" w:tplc="8AC093AA">
       <w:numFmt w:val="decimal"/>
       <w:lvlText w:val=""/>
       <w:lvlJc w:val="left"/>
     </w:lvl>
-    <w:lvl w:ilvl="3" w:tplc="019C2EAC">
+    <w:lvl w:ilvl="3" w:tplc="6CFC7BEC">
       <w:numFmt w:val="decimal"/>
       <w:lvlText w:val=""/>
       <w:lvlJc w:val="left"/>
     </w:lvl>
-    <w:lvl w:ilvl="4" w:tplc="D6C4D184">
+    <w:lvl w:ilvl="4" w:tplc="6BD8DC16">
       <w:numFmt w:val="decimal"/>
       <w:lvlText w:val=""/>
       <w:lvlJc w:val="left"/>
     </w:lvl>
-    <w:lvl w:ilvl="5" w:tplc="36909A16">
+    <w:lvl w:ilvl="5" w:tplc="C556F9BC">
       <w:numFmt w:val="decimal"/>
       <w:lvlText w:val=""/>
       <w:lvlJc w:val="left"/>
     </w:lvl>
-    <w:lvl w:ilvl="6" w:tplc="D408EF86">
+    <w:lvl w:ilvl="6" w:tplc="250CB0F4">
       <w:numFmt w:val="decimal"/>
       <w:lvlText w:val=""/>
       <w:lvlJc w:val="left"/>
     </w:lvl>
-    <w:lvl w:ilvl="7" w:tplc="A086BCC8">
+    <w:lvl w:ilvl="7" w:tplc="3836C3BA">
       <w:numFmt w:val="decimal"/>
       <w:lvlText w:val=""/>
       <w:lvlJc w:val="left"/>
     </w:lvl>
-    <w:lvl w:ilvl="8" w:tplc="D9A4E624">
-      <w:numFmt w:val="decimal"/>
-      <w:lvlText w:val=""/>
-      <w:lvlJc w:val="left"/>
-    </w:lvl>
-  </w:abstractNum>
-  <w:abstractNum w:abstractNumId="2" w15:restartNumberingAfterBreak="0">
-    <w:nsid w:val="5F8422BA"/>
-    <w:multiLevelType w:val="hybridMultilevel"/>
-    <w:tmpl w:val="EC006FD2"/>
-    <w:lvl w:ilvl="0" w:tplc="6D26E83E">
-      <w:start w:val="1"/>
-      <w:numFmt w:val="decimal"/>
-      <w:lvlText w:val="%1."/>
-      <w:lvlJc w:val="left"/>
-      <w:pPr>
-        <w:ind w:left="540" w:hanging="300"/>
-      </w:pPr>
-    </w:lvl>
-    <w:lvl w:ilvl="1" w:tplc="460A57A2">
-      <w:numFmt w:val="decimal"/>
-      <w:lvlText w:val=""/>
-      <w:lvlJc w:val="left"/>
-    </w:lvl>
-    <w:lvl w:ilvl="2" w:tplc="54C69C52">
-      <w:numFmt w:val="decimal"/>
-      <w:lvlText w:val=""/>
-      <w:lvlJc w:val="left"/>
-    </w:lvl>
-    <w:lvl w:ilvl="3" w:tplc="96C0DB16">
-      <w:numFmt w:val="decimal"/>
-      <w:lvlText w:val=""/>
-      <w:lvlJc w:val="left"/>
-    </w:lvl>
-    <w:lvl w:ilvl="4" w:tplc="551A5090">
-      <w:numFmt w:val="decimal"/>
-      <w:lvlText w:val=""/>
-      <w:lvlJc w:val="left"/>
-    </w:lvl>
-    <w:lvl w:ilvl="5" w:tplc="3ECEC15C">
-      <w:numFmt w:val="decimal"/>
-      <w:lvlText w:val=""/>
-      <w:lvlJc w:val="left"/>
-    </w:lvl>
-    <w:lvl w:ilvl="6" w:tplc="5C7A358A">
-      <w:numFmt w:val="decimal"/>
-      <w:lvlText w:val=""/>
-      <w:lvlJc w:val="left"/>
-    </w:lvl>
-    <w:lvl w:ilvl="7" w:tplc="62A2534C">
-      <w:numFmt w:val="decimal"/>
-      <w:lvlText w:val=""/>
-      <w:lvlJc w:val="left"/>
-    </w:lvl>
-    <w:lvl w:ilvl="8" w:tplc="2326C9E8">
+    <w:lvl w:ilvl="8" w:tplc="55A61A2E">
       <w:numFmt w:val="decimal"/>
       <w:lvlText w:val=""/>
       <w:lvlJc w:val="left"/>
     </w:lvl>
   </w:abstractNum>
   <w:abstractNum w:abstractNumId="3" w15:restartNumberingAfterBreak="0">
-    <w:nsid w:val="699E1839"/>
+    <w:nsid w:val="7370540C"/>
     <w:multiLevelType w:val="hybridMultilevel"/>
-    <w:tmpl w:val="669E11E0"/>
-    <w:lvl w:ilvl="0" w:tplc="21E0F98E" w:tentative="1">
+    <w:tmpl w:val="6C488FB8"/>
+    <w:lvl w:ilvl="0" w:tplc="FE3AC1E6" w:tentative="1">
       <w:start w:val="1"/>
       <w:numFmt w:val="bullet"/>
       <w:lvlText w:val="●"/>
@@ -20961,7 +22095,7 @@
         <w:ind w:left="720" w:hanging="360"/>
       </w:pPr>
     </w:lvl>
-    <w:lvl w:ilvl="1" w:tplc="5EDA5EF0" w:tentative="1">
+    <w:lvl w:ilvl="1" w:tplc="4AFE418A" w:tentative="1">
       <w:start w:val="1"/>
       <w:numFmt w:val="bullet"/>
       <w:lvlText w:val="○"/>
@@ -20970,7 +22104,7 @@
         <w:ind w:left="1440" w:hanging="360"/>
       </w:pPr>
     </w:lvl>
-    <w:lvl w:ilvl="2" w:tplc="8BC8042E" w:tentative="1">
+    <w:lvl w:ilvl="2" w:tplc="B0ECE282" w:tentative="1">
       <w:start w:val="1"/>
       <w:numFmt w:val="bullet"/>
       <w:lvlText w:val="■"/>
@@ -20979,7 +22113,7 @@
         <w:ind w:left="2160" w:hanging="360"/>
       </w:pPr>
     </w:lvl>
-    <w:lvl w:ilvl="3" w:tplc="BE7E83E8" w:tentative="1">
+    <w:lvl w:ilvl="3" w:tplc="2BD036D6" w:tentative="1">
       <w:start w:val="1"/>
       <w:numFmt w:val="bullet"/>
       <w:lvlText w:val="●"/>
@@ -20988,7 +22122,7 @@
         <w:ind w:left="2880" w:hanging="360"/>
       </w:pPr>
     </w:lvl>
-    <w:lvl w:ilvl="4" w:tplc="D9BC89F6" w:tentative="1">
+    <w:lvl w:ilvl="4" w:tplc="00E0EA3E" w:tentative="1">
       <w:start w:val="1"/>
       <w:numFmt w:val="bullet"/>
       <w:lvlText w:val="○"/>
@@ -20997,7 +22131,7 @@
         <w:ind w:left="3600" w:hanging="360"/>
       </w:pPr>
     </w:lvl>
-    <w:lvl w:ilvl="5" w:tplc="2A0204E4" w:tentative="1">
+    <w:lvl w:ilvl="5" w:tplc="D040CB9E" w:tentative="1">
       <w:start w:val="1"/>
       <w:numFmt w:val="bullet"/>
       <w:lvlText w:val="■"/>
@@ -21006,7 +22140,7 @@
         <w:ind w:left="4320" w:hanging="360"/>
       </w:pPr>
     </w:lvl>
-    <w:lvl w:ilvl="6" w:tplc="F81ABC7A" w:tentative="1">
+    <w:lvl w:ilvl="6" w:tplc="1A663B66" w:tentative="1">
       <w:start w:val="1"/>
       <w:numFmt w:val="bullet"/>
       <w:lvlText w:val="●"/>
@@ -21015,7 +22149,7 @@
         <w:ind w:left="5040" w:hanging="360"/>
       </w:pPr>
     </w:lvl>
-    <w:lvl w:ilvl="7" w:tplc="321CC9EE" w:tentative="1">
+    <w:lvl w:ilvl="7" w:tplc="1208003A" w:tentative="1">
       <w:start w:val="1"/>
       <w:numFmt w:val="bullet"/>
       <w:lvlText w:val="●"/>
@@ -21024,7 +22158,7 @@
         <w:ind w:left="5760" w:hanging="360"/>
       </w:pPr>
     </w:lvl>
-    <w:lvl w:ilvl="8" w:tplc="54DE5E22" w:tentative="1">
+    <w:lvl w:ilvl="8" w:tplc="1A92A1E0" w:tentative="1">
       <w:start w:val="1"/>
       <w:numFmt w:val="bullet"/>
       <w:lvlText w:val="●"/>
@@ -21034,14 +22168,68 @@
       </w:pPr>
     </w:lvl>
   </w:abstractNum>
-  <w:num w:numId="1" w16cid:durableId="1488285411">
+  <w:abstractNum w:abstractNumId="4" w15:restartNumberingAfterBreak="0">
+    <w:nsid w:val="7E735535"/>
+    <w:multiLevelType w:val="hybridMultilevel"/>
+    <w:tmpl w:val="136096AA"/>
+    <w:lvl w:ilvl="0" w:tplc="68F64468">
+      <w:start w:val="1"/>
+      <w:numFmt w:val="decimal"/>
+      <w:lvlText w:val="%1."/>
+      <w:lvlJc w:val="left"/>
+      <w:pPr>
+        <w:ind w:left="540" w:hanging="300"/>
+      </w:pPr>
+    </w:lvl>
+    <w:lvl w:ilvl="1" w:tplc="ADBA45EE">
+      <w:numFmt w:val="decimal"/>
+      <w:lvlText w:val=""/>
+      <w:lvlJc w:val="left"/>
+    </w:lvl>
+    <w:lvl w:ilvl="2" w:tplc="2BD2767A">
+      <w:numFmt w:val="decimal"/>
+      <w:lvlText w:val=""/>
+      <w:lvlJc w:val="left"/>
+    </w:lvl>
+    <w:lvl w:ilvl="3" w:tplc="A4A4D8B6">
+      <w:numFmt w:val="decimal"/>
+      <w:lvlText w:val=""/>
+      <w:lvlJc w:val="left"/>
+    </w:lvl>
+    <w:lvl w:ilvl="4" w:tplc="66DEAA14">
+      <w:numFmt w:val="decimal"/>
+      <w:lvlText w:val=""/>
+      <w:lvlJc w:val="left"/>
+    </w:lvl>
+    <w:lvl w:ilvl="5" w:tplc="6164C640">
+      <w:numFmt w:val="decimal"/>
+      <w:lvlText w:val=""/>
+      <w:lvlJc w:val="left"/>
+    </w:lvl>
+    <w:lvl w:ilvl="6" w:tplc="F8E611C8">
+      <w:numFmt w:val="decimal"/>
+      <w:lvlText w:val=""/>
+      <w:lvlJc w:val="left"/>
+    </w:lvl>
+    <w:lvl w:ilvl="7" w:tplc="9F96E5D0">
+      <w:numFmt w:val="decimal"/>
+      <w:lvlText w:val=""/>
+      <w:lvlJc w:val="left"/>
+    </w:lvl>
+    <w:lvl w:ilvl="8" w:tplc="DBB2E82A">
+      <w:numFmt w:val="decimal"/>
+      <w:lvlText w:val=""/>
+      <w:lvlJc w:val="left"/>
+    </w:lvl>
+  </w:abstractNum>
+  <w:num w:numId="1" w16cid:durableId="1111241707">
     <w:abstractNumId w:val="3"/>
     <w:lvlOverride w:ilvl="0">
       <w:startOverride w:val="1"/>
     </w:lvlOverride>
   </w:num>
-  <w:num w:numId="2" w16cid:durableId="1137647100">
-    <w:abstractNumId w:val="0"/>
+  <w:num w:numId="2" w16cid:durableId="146434628">
+    <w:abstractNumId w:val="1"/>
     <w:lvlOverride w:ilvl="0">
       <w:startOverride w:val="1"/>
     </w:lvlOverride>
@@ -21049,14 +22237,20 @@
       <w:startOverride w:val="1"/>
     </w:lvlOverride>
   </w:num>
-  <w:num w:numId="3" w16cid:durableId="1873881960">
-    <w:abstractNumId w:val="2"/>
+  <w:num w:numId="3" w16cid:durableId="496265455">
+    <w:abstractNumId w:val="0"/>
     <w:lvlOverride w:ilvl="0">
       <w:startOverride w:val="1"/>
     </w:lvlOverride>
   </w:num>
-  <w:num w:numId="4" w16cid:durableId="1419207041">
-    <w:abstractNumId w:val="1"/>
+  <w:num w:numId="4" w16cid:durableId="1167483059">
+    <w:abstractNumId w:val="4"/>
+    <w:lvlOverride w:ilvl="0">
+      <w:startOverride w:val="1"/>
+    </w:lvlOverride>
+  </w:num>
+  <w:num w:numId="5" w16cid:durableId="1030688832">
+    <w:abstractNumId w:val="2"/>
     <w:lvlOverride w:ilvl="0">
       <w:startOverride w:val="1"/>
     </w:lvlOverride>
@@ -21699,7 +22893,7 @@
     <w:autoRedefine/>
     <w:uiPriority w:val="39"/>
     <w:unhideWhenUsed/>
-    <w:rsid w:val="00CC3F64"/>
+    <w:rsid w:val="00A04D13"/>
     <w:pPr>
       <w:spacing w:after="100"/>
     </w:pPr>
@@ -21711,7 +22905,7 @@
     <w:autoRedefine/>
     <w:uiPriority w:val="39"/>
     <w:unhideWhenUsed/>
-    <w:rsid w:val="00CC3F64"/>
+    <w:rsid w:val="00A04D13"/>
     <w:pPr>
       <w:spacing w:after="100"/>
       <w:ind w:left="210"/>

</xml_diff>